<commit_message>
fix(s2,s11): implement hanging indent alignment, label bold inheritance and s11 paradigm routing
</commit_message>
<xml_diff>
--- a/算法训练材料/PU-202A/PU-202A msds_CN 冠志.docx
+++ b/算法训练材料/PU-202A/PU-202A msds_CN 冠志.docx
@@ -1514,7 +1514,7 @@
           <w:p>
             <w:pPr>
               <w:spacing w:line="300" w:lineRule="auto"/>
-              <w:ind w:firstLine="1200"/>
+              <w:ind w:left="480"/>
             </w:pPr>
             <w:r>
               <w:rPr>
@@ -1527,7 +1527,7 @@
           <w:p>
             <w:pPr>
               <w:spacing w:line="300" w:lineRule="auto"/>
-              <w:ind w:firstLine="1200"/>
+              <w:ind w:left="480"/>
             </w:pPr>
             <w:r>
               <w:rPr>
@@ -1540,7 +1540,7 @@
           <w:p>
             <w:pPr>
               <w:spacing w:line="300" w:lineRule="auto"/>
-              <w:ind w:firstLine="1200"/>
+              <w:ind w:left="480"/>
             </w:pPr>
             <w:r>
               <w:rPr>
@@ -1553,7 +1553,7 @@
           <w:p>
             <w:pPr>
               <w:spacing w:line="300" w:lineRule="auto"/>
-              <w:ind w:firstLine="1200"/>
+              <w:ind w:left="480"/>
             </w:pPr>
             <w:r>
               <w:rPr>
@@ -1566,7 +1566,7 @@
           <w:p>
             <w:pPr>
               <w:spacing w:line="300" w:lineRule="auto"/>
-              <w:ind w:firstLine="1200"/>
+              <w:ind w:left="480"/>
             </w:pPr>
             <w:r>
               <w:rPr>
@@ -1579,7 +1579,7 @@
           <w:p>
             <w:pPr>
               <w:spacing w:line="300" w:lineRule="auto"/>
-              <w:ind w:firstLine="1200"/>
+              <w:ind w:left="480"/>
             </w:pPr>
             <w:r>
               <w:rPr>
@@ -1605,7 +1605,7 @@
           <w:p>
             <w:pPr>
               <w:spacing w:line="300" w:lineRule="auto"/>
-              <w:ind w:firstLine="482"/>
+              <w:ind w:left="480"/>
             </w:pPr>
             <w:r>
               <w:rPr>
@@ -1619,7 +1619,7 @@
           <w:p>
             <w:pPr>
               <w:spacing w:line="300" w:lineRule="auto"/>
-              <w:ind w:firstLine="1200"/>
+              <w:ind w:left="960"/>
             </w:pPr>
             <w:r>
               <w:rPr>
@@ -1632,7 +1632,7 @@
           <w:p>
             <w:pPr>
               <w:spacing w:line="300" w:lineRule="auto"/>
-              <w:ind w:firstLine="1200"/>
+              <w:ind w:left="960"/>
             </w:pPr>
             <w:r>
               <w:rPr>
@@ -1645,7 +1645,7 @@
           <w:p>
             <w:pPr>
               <w:spacing w:line="300" w:lineRule="auto"/>
-              <w:ind w:firstLine="1200"/>
+              <w:ind w:left="960"/>
             </w:pPr>
             <w:r>
               <w:rPr>
@@ -1658,7 +1658,7 @@
           <w:p>
             <w:pPr>
               <w:spacing w:line="300" w:lineRule="auto"/>
-              <w:ind w:firstLine="1200"/>
+              <w:ind w:left="960"/>
             </w:pPr>
             <w:r>
               <w:rPr>
@@ -1671,7 +1671,7 @@
           <w:p>
             <w:pPr>
               <w:spacing w:line="300" w:lineRule="auto"/>
-              <w:ind w:firstLine="1200"/>
+              <w:ind w:left="960"/>
             </w:pPr>
             <w:r>
               <w:rPr>
@@ -1684,7 +1684,7 @@
           <w:p>
             <w:pPr>
               <w:spacing w:line="300" w:lineRule="auto"/>
-              <w:ind w:firstLine="1200"/>
+              <w:ind w:left="960"/>
             </w:pPr>
             <w:r>
               <w:rPr>
@@ -1697,7 +1697,7 @@
           <w:p>
             <w:pPr>
               <w:spacing w:line="300" w:lineRule="auto"/>
-              <w:ind w:firstLine="1200"/>
+              <w:ind w:left="960"/>
             </w:pPr>
             <w:r>
               <w:rPr>
@@ -1710,7 +1710,7 @@
           <w:p>
             <w:pPr>
               <w:spacing w:line="300" w:lineRule="auto"/>
-              <w:ind w:firstLine="482"/>
+              <w:ind w:left="480"/>
             </w:pPr>
             <w:r>
               <w:rPr>
@@ -1724,7 +1724,7 @@
           <w:p>
             <w:pPr>
               <w:spacing w:line="300" w:lineRule="auto"/>
-              <w:ind w:firstLine="1200"/>
+              <w:ind w:left="960"/>
             </w:pPr>
             <w:r>
               <w:rPr>
@@ -1737,7 +1737,7 @@
           <w:p>
             <w:pPr>
               <w:spacing w:line="300" w:lineRule="auto"/>
-              <w:ind w:firstLine="1200"/>
+              <w:ind w:left="960"/>
             </w:pPr>
             <w:r>
               <w:rPr>
@@ -1750,7 +1750,7 @@
           <w:p>
             <w:pPr>
               <w:spacing w:line="300" w:lineRule="auto"/>
-              <w:ind w:firstLine="1200"/>
+              <w:ind w:left="960"/>
             </w:pPr>
             <w:r>
               <w:rPr>
@@ -1763,7 +1763,7 @@
           <w:p>
             <w:pPr>
               <w:spacing w:line="300" w:lineRule="auto"/>
-              <w:ind w:firstLine="1200"/>
+              <w:ind w:left="960"/>
             </w:pPr>
             <w:r>
               <w:rPr>
@@ -1776,7 +1776,7 @@
           <w:p>
             <w:pPr>
               <w:spacing w:line="300" w:lineRule="auto"/>
-              <w:ind w:firstLine="1200"/>
+              <w:ind w:left="960"/>
             </w:pPr>
             <w:r>
               <w:rPr>
@@ -1789,7 +1789,7 @@
           <w:p>
             <w:pPr>
               <w:spacing w:line="300" w:lineRule="auto"/>
-              <w:ind w:firstLine="482"/>
+              <w:ind w:left="480"/>
             </w:pPr>
             <w:r>
               <w:rPr>
@@ -1803,7 +1803,7 @@
           <w:p>
             <w:pPr>
               <w:spacing w:line="300" w:lineRule="auto"/>
-              <w:ind w:firstLine="1200"/>
+              <w:ind w:left="960"/>
             </w:pPr>
             <w:r>
               <w:rPr>
@@ -1816,7 +1816,7 @@
           <w:p>
             <w:pPr>
               <w:spacing w:line="300" w:lineRule="auto"/>
-              <w:ind w:firstLine="482"/>
+              <w:ind w:left="480"/>
             </w:pPr>
             <w:r>
               <w:rPr>
@@ -1830,7 +1830,7 @@
           <w:p>
             <w:pPr>
               <w:spacing w:line="300" w:lineRule="auto"/>
-              <w:ind w:firstLine="1200"/>
+              <w:ind w:left="960"/>
             </w:pPr>
             <w:r>
               <w:rPr>
@@ -1848,8 +1848,16 @@
               <w:rPr>
                 <w:rFonts w:hint="eastAsia" w:ascii="Times New Roman" w:hAnsi="Times New Roman" w:eastAsia="宋体"/>
                 <w:sz w:val="24"/>
-              </w:rPr>
-              <w:t xml:space="preserve">其他危险：无适用资料。</w:t>
+                <w:b/>
+              </w:rPr>
+              <w:t xml:space="preserve">其他危险：</w:t>
+            </w:r>
+            <w:r>
+              <w:rPr>
+                <w:rFonts w:hint="eastAsia" w:ascii="Times New Roman" w:hAnsi="Times New Roman" w:eastAsia="宋体"/>
+                <w:sz w:val="24"/>
+              </w:rPr>
+              <w:t xml:space="preserve">无适用资料。</w:t>
             </w:r>
           </w:p>
         </w:tc>
@@ -10214,24 +10222,39 @@
           <w:tcPr>
             <w:tcW w:w="9781" w:type="dxa"/>
             <w:gridSpan w:val="4"/>
-            <w:vAlign w:val="center"/>
-            <w:tcBorders>
-              <w:top w:val="dotted" w:color="auto" w:sz="4" w:space="0"/>
-              <w:bottom w:val="dotted" w:color="auto" w:sz="4" w:space="0"/>
-              <w:right w:val="dotted" w:color="auto" w:sz="4" w:space="0"/>
-            </w:tcBorders>
-          </w:tcPr>
-          <w:p>
-            <w:pPr>
-              <w:jc w:val="left"/>
-              <w:spacing w:line="300" w:lineRule="auto"/>
-            </w:pPr>
-            <w:r>
-              <w:rPr>
-                <w:rFonts w:hint="eastAsia" w:ascii="宋体" w:hAnsi="宋体" w:eastAsia="宋体"/>
-                <w:sz w:val="24"/>
-              </w:rPr>
-              <w:t xml:space="preserve">该产品无可用的毒理学研究。</w:t>
+            <w:tcBorders>
+              <w:top w:val="single" w:color="auto" w:sz="4" w:space="0"/>
+              <w:bottom w:val="dotted" w:color="auto" w:sz="4" w:space="0"/>
+            </w:tcBorders>
+          </w:tcPr>
+          <w:p>
+            <w:pPr>
+              <w:keepNext w:val="0"/>
+              <w:keepLines w:val="0"/>
+              <w:pageBreakBefore w:val="0"/>
+              <w:widowControl w:val="0"/>
+              <w:kinsoku/>
+              <w:wordWrap/>
+              <w:overflowPunct/>
+              <w:topLinePunct w:val="0"/>
+              <w:autoSpaceDE/>
+              <w:autoSpaceDN/>
+              <w:bidi w:val="0"/>
+              <w:adjustRightInd/>
+              <w:snapToGrid/>
+              <w:spacing w:line="300" w:lineRule="auto"/>
+              <w:jc w:val="left"/>
+              <w:textAlignment w:val="auto"/>
+              <w:rPr>
+                <w:sz w:val="24"/>
+              </w:rPr>
+            </w:pPr>
+            <w:r>
+              <w:rPr>
+                <w:rFonts w:hint="eastAsia" w:hAnsi="Arial"/>
+                <w:sz w:val="24"/>
+              </w:rPr>
+              <w:t>该产品无可用的毒理学研究。</w:t>
             </w:r>
           </w:p>
         </w:tc>
@@ -10242,24 +10265,13 @@
           <w:tcPr>
             <w:tcW w:w="9781" w:type="dxa"/>
             <w:gridSpan w:val="4"/>
-            <w:vAlign w:val="center"/>
-            <w:tcBorders>
-              <w:top w:val="dotted" w:color="auto" w:sz="4" w:space="0"/>
-              <w:bottom w:val="dotted" w:color="auto" w:sz="4" w:space="0"/>
-              <w:right w:val="dotted" w:color="auto" w:sz="4" w:space="0"/>
-            </w:tcBorders>
-          </w:tcPr>
-          <w:p>
-            <w:pPr>
-              <w:jc w:val="left"/>
-              <w:spacing w:line="300" w:lineRule="auto"/>
-              <w:ind w:left="34"/>
-            </w:pPr>
-            <w:r>
-              <w:rPr>
-                <w:rFonts w:hint="eastAsia" w:ascii="宋体" w:hAnsi="宋体" w:eastAsia="宋体"/>
-                <w:sz w:val="24"/>
-              </w:rPr>
+            <w:tcBorders>
+              <w:top w:val="dotted" w:color="auto" w:sz="4" w:space="0"/>
+              <w:bottom w:val="dotted" w:color="auto" w:sz="4" w:space="0"/>
+            </w:tcBorders>
+          </w:tcPr>
+          <w:p>
+            <w:r>
               <w:t xml:space="preserve">以下是N,N－二甲基乙酰胺毒理学数据：</w:t>
             </w:r>
           </w:p>
@@ -10287,224 +10299,1677 @@
         </w:trPr>
         <w:tc>
           <w:tcPr>
-            <w:tcW w:w="9781" w:type="dxa"/>
-            <w:gridSpan w:val="4"/>
+            <w:tcW w:w="3519" w:type="dxa"/>
+            <w:vMerge w:val="restart"/>
+            <w:tcBorders>
+              <w:top w:val="dotted" w:color="auto" w:sz="4" w:space="0"/>
+              <w:bottom w:val="dotted" w:color="auto" w:sz="4" w:space="0"/>
+              <w:right w:val="dotted" w:color="auto" w:sz="4" w:space="0"/>
+            </w:tcBorders>
             <w:vAlign w:val="center"/>
-            <w:tcBorders>
-              <w:top w:val="dotted" w:color="auto" w:sz="4" w:space="0"/>
+          </w:tcPr>
+          <w:p>
+            <w:pPr>
+              <w:keepNext w:val="0"/>
+              <w:keepLines w:val="0"/>
+              <w:pageBreakBefore w:val="0"/>
+              <w:widowControl w:val="0"/>
+              <w:numPr>
+                <w:ilvl w:val="1"/>
+                <w:numId w:val="0"/>
+              </w:numPr>
+              <w:kinsoku/>
+              <w:wordWrap/>
+              <w:overflowPunct/>
+              <w:topLinePunct w:val="0"/>
+              <w:autoSpaceDE/>
+              <w:autoSpaceDN/>
+              <w:bidi w:val="0"/>
+              <w:adjustRightInd/>
+              <w:snapToGrid/>
+              <w:spacing w:line="300" w:lineRule="auto"/>
+              <w:ind w:left="599" w:leftChars="16" w:hanging="565" w:hangingChars="268"/>
+              <w:jc w:val="left"/>
+              <w:textAlignment w:val="auto"/>
+              <w:rPr>
+                <w:b/>
+                <w:sz w:val="24"/>
+              </w:rPr>
+            </w:pPr>
+            <w:r>
+              <w:rPr>
+                <w:rFonts w:hint="default" w:ascii="Times New Roman" w:hAnsi="Times New Roman" w:eastAsia="宋体" w:cs="Times New Roman"/>
+                <w:b/>
+                <w:kern w:val="2"/>
+                <w:sz w:val="21"/>
+                <w:szCs w:val="21"/>
+                <w:lang w:val="en-US" w:eastAsia="zh-CN" w:bidi="ar-SA"/>
+              </w:rPr>
+              <w:t>11.1</w:t>
+            </w:r>
+            <w:r>
+              <w:rPr>
+                <w:rFonts w:hint="eastAsia" w:ascii="Times New Roman" w:hAnsi="Times New Roman" w:eastAsia="宋体" w:cs="Times New Roman"/>
+                <w:b/>
+                <w:kern w:val="2"/>
+                <w:sz w:val="21"/>
+                <w:szCs w:val="21"/>
+                <w:lang w:val="en-US" w:eastAsia="zh-CN" w:bidi="ar-SA"/>
+              </w:rPr>
+              <w:t xml:space="preserve"> </w:t>
+            </w:r>
+            <w:r>
+              <w:rPr>
+                <w:rFonts w:hint="eastAsia" w:cs="Times New Roman"/>
+                <w:b/>
+                <w:kern w:val="2"/>
+                <w:sz w:val="21"/>
+                <w:szCs w:val="21"/>
+                <w:lang w:val="en-US" w:eastAsia="zh-CN" w:bidi="ar-SA"/>
+              </w:rPr>
+              <w:t xml:space="preserve"> </w:t>
+            </w:r>
+            <w:r>
+              <w:rPr>
+                <w:rFonts w:hint="eastAsia" w:hAnsi="Arial"/>
+                <w:b/>
+                <w:sz w:val="24"/>
+              </w:rPr>
+              <w:t>急性毒性：</w:t>
+            </w:r>
+          </w:p>
+        </w:tc>
+        <w:tc>
+          <w:tcPr>
+            <w:tcW w:w="1311" w:type="dxa"/>
+            <w:tcBorders>
+              <w:top w:val="dotted" w:color="auto" w:sz="4" w:space="0"/>
+              <w:left w:val="dotted" w:color="auto" w:sz="4" w:space="0"/>
               <w:bottom w:val="dotted" w:color="auto" w:sz="4" w:space="0"/>
               <w:right w:val="dotted" w:color="auto" w:sz="4" w:space="0"/>
             </w:tcBorders>
-          </w:tcPr>
-          <w:p>
-            <w:pPr>
-              <w:jc w:val="left"/>
-              <w:spacing w:line="300" w:lineRule="auto"/>
-              <w:ind w:left="34"/>
-            </w:pPr>
-            <w:r>
-              <w:rPr>
-                <w:rFonts w:hint="eastAsia" w:ascii="宋体" w:hAnsi="宋体" w:eastAsia="宋体"/>
-                <w:sz w:val="24"/>
-                <w:b/>
-              </w:rPr>
-              <w:t xml:space="preserve">N,N-二甲基乙酰胺：</w:t>
-            </w:r>
-            <w:r>
-              <w:rPr>
-                <w:rFonts w:hint="eastAsia" w:ascii="宋体" w:hAnsi="宋体" w:eastAsia="宋体"/>
-                <w:sz w:val="24"/>
-              </w:rPr>
-              <w:br w:type="textWrapping"/>
-            </w:r>
-            <w:r>
-              <w:rPr>
-                <w:rFonts w:hint="eastAsia" w:ascii="宋体" w:hAnsi="宋体" w:eastAsia="宋体"/>
-                <w:sz w:val="24"/>
-              </w:rPr>
-              <w:t xml:space="preserve">急性毒性：</w:t>
-            </w:r>
-            <w:r>
-              <w:rPr>
-                <w:rFonts w:hint="eastAsia" w:ascii="宋体" w:hAnsi="宋体" w:eastAsia="宋体"/>
-                <w:sz w:val="24"/>
-              </w:rPr>
-              <w:br w:type="textWrapping"/>
-            </w:r>
-            <w:r>
-              <w:rPr>
-                <w:rFonts w:hint="eastAsia" w:ascii="宋体" w:hAnsi="宋体" w:eastAsia="宋体"/>
-                <w:sz w:val="24"/>
-              </w:rPr>
-              <w:t xml:space="preserve">经口：半数致死剂量（LD50）/大鼠：3,000－6,000mg/kg</w:t>
-            </w:r>
-            <w:r>
-              <w:rPr>
-                <w:rFonts w:hint="eastAsia" w:ascii="宋体" w:hAnsi="宋体" w:eastAsia="宋体"/>
-                <w:sz w:val="24"/>
-              </w:rPr>
-              <w:br w:type="textWrapping"/>
-            </w:r>
-            <w:r>
-              <w:rPr>
-                <w:rFonts w:hint="eastAsia" w:ascii="宋体" w:hAnsi="宋体" w:eastAsia="宋体"/>
-                <w:sz w:val="24"/>
-              </w:rPr>
-              <w:t xml:space="preserve">吸入：半数致死浓度（LC50）/1h/大鼠 雌性：8.81mg/l（此值仅用于有可吸入的颗粒形成的情况。）</w:t>
-            </w:r>
-            <w:r>
-              <w:rPr>
-                <w:rFonts w:hint="eastAsia" w:ascii="宋体" w:hAnsi="宋体" w:eastAsia="宋体"/>
-                <w:sz w:val="24"/>
-              </w:rPr>
-              <w:br w:type="textWrapping"/>
-            </w:r>
-            <w:r>
-              <w:rPr>
-                <w:rFonts w:hint="eastAsia" w:ascii="宋体" w:hAnsi="宋体" w:eastAsia="宋体"/>
-                <w:sz w:val="24"/>
-              </w:rPr>
-              <w:t xml:space="preserve">主要皮肤刺激性：物种：兔子；分类：刺激皮肤；结果：轻度的皮肤刺激</w:t>
-            </w:r>
-            <w:r>
-              <w:rPr>
-                <w:rFonts w:hint="eastAsia" w:ascii="宋体" w:hAnsi="宋体" w:eastAsia="宋体"/>
-                <w:sz w:val="24"/>
-              </w:rPr>
-              <w:br w:type="textWrapping"/>
-            </w:r>
-            <w:r>
-              <w:rPr>
-                <w:rFonts w:hint="eastAsia" w:ascii="宋体" w:hAnsi="宋体" w:eastAsia="宋体"/>
-                <w:sz w:val="24"/>
-              </w:rPr>
-              <w:t xml:space="preserve">主要粘膜刺激性：物种：兔子；分类：刺激眼睛；结果：轻度的眼睛刺激</w:t>
-            </w:r>
-            <w:r>
-              <w:rPr>
-                <w:rFonts w:hint="eastAsia" w:ascii="宋体" w:hAnsi="宋体" w:eastAsia="宋体"/>
-                <w:sz w:val="24"/>
-              </w:rPr>
-              <w:br w:type="textWrapping"/>
-            </w:r>
-            <w:r>
-              <w:rPr>
-                <w:rFonts w:hint="eastAsia" w:ascii="宋体" w:hAnsi="宋体" w:eastAsia="宋体"/>
-                <w:sz w:val="24"/>
-              </w:rPr>
-              <w:t xml:space="preserve">致敏性：物种：豚鼠；分类：不是皮肤过敏物质；结果：未引起实验室动物过敏；物种：人类；分类：不是皮肤过敏物质；结果：对志愿者做的皮肤接触试验证明没有过敏特性</w:t>
-            </w:r>
-            <w:r>
-              <w:rPr>
-                <w:rFonts w:hint="eastAsia" w:ascii="宋体" w:hAnsi="宋体" w:eastAsia="宋体"/>
-                <w:sz w:val="24"/>
-              </w:rPr>
-              <w:br w:type="textWrapping"/>
-            </w:r>
-            <w:r>
-              <w:rPr>
-                <w:rFonts w:hint="eastAsia" w:ascii="宋体" w:hAnsi="宋体" w:eastAsia="宋体"/>
-                <w:sz w:val="24"/>
-              </w:rPr>
-              <w:t xml:space="preserve">致突变性：在细菌细胞培养中没有引起基因损害。在哺乳类细胞培养中没有引起基因损害。有证据认为此物质不会在动物中引起基因损伤。</w:t>
-            </w:r>
-            <w:r>
-              <w:rPr>
-                <w:rFonts w:hint="eastAsia" w:ascii="宋体" w:hAnsi="宋体" w:eastAsia="宋体"/>
-                <w:sz w:val="24"/>
-              </w:rPr>
-              <w:br w:type="textWrapping"/>
-            </w:r>
-            <w:r>
-              <w:rPr>
-                <w:rFonts w:hint="eastAsia" w:ascii="宋体" w:hAnsi="宋体" w:eastAsia="宋体"/>
-                <w:sz w:val="24"/>
-              </w:rPr>
-              <w:t xml:space="preserve">致癌性：在动物试验中未见致癌影响。</w:t>
-            </w:r>
-            <w:r>
-              <w:rPr>
-                <w:rFonts w:hint="eastAsia" w:ascii="宋体" w:hAnsi="宋体" w:eastAsia="宋体"/>
-                <w:sz w:val="24"/>
-              </w:rPr>
-              <w:br w:type="textWrapping"/>
-            </w:r>
-            <w:r>
-              <w:rPr>
-                <w:rFonts w:hint="eastAsia" w:ascii="宋体" w:hAnsi="宋体" w:eastAsia="宋体"/>
-                <w:sz w:val="24"/>
-              </w:rPr>
-              <w:t xml:space="preserve">生殖毒性：动物试验表明无生殖毒性。动物实验表明在低于那些引起母体中毒的量时，对胚胎有影响。降低了胚胎胎儿的成活力，胎儿发育缓慢（变异），胎儿畸形。</w:t>
-            </w:r>
-            <w:r>
-              <w:rPr>
-                <w:rFonts w:hint="eastAsia" w:ascii="宋体" w:hAnsi="宋体" w:eastAsia="宋体"/>
-                <w:sz w:val="24"/>
-              </w:rPr>
-              <w:br w:type="textWrapping"/>
-            </w:r>
-            <w:r>
-              <w:rPr>
-                <w:rFonts w:hint="eastAsia" w:ascii="宋体" w:hAnsi="宋体" w:eastAsia="宋体"/>
-                <w:sz w:val="24"/>
-              </w:rPr>
-              <w:t xml:space="preserve">特异性靶器官系统毒性（一次接触/反复接触）：无数据资料。</w:t>
-            </w:r>
-            <w:r>
-              <w:rPr>
-                <w:rFonts w:hint="eastAsia" w:ascii="宋体" w:hAnsi="宋体" w:eastAsia="宋体"/>
-                <w:sz w:val="24"/>
-              </w:rPr>
-              <w:br w:type="textWrapping"/>
-            </w:r>
-            <w:r>
-              <w:rPr>
-                <w:rFonts w:hint="eastAsia" w:ascii="宋体" w:hAnsi="宋体" w:eastAsia="宋体"/>
-                <w:sz w:val="24"/>
-              </w:rPr>
-              <w:t xml:space="preserve">吸入危险：无数据资料。</w:t>
-            </w:r>
-            <w:r>
-              <w:rPr>
-                <w:rFonts w:hint="eastAsia" w:ascii="宋体" w:hAnsi="宋体" w:eastAsia="宋体"/>
-                <w:sz w:val="24"/>
-              </w:rPr>
-              <w:br w:type="textWrapping"/>
-            </w:r>
-            <w:r>
-              <w:rPr>
-                <w:rFonts w:hint="eastAsia" w:ascii="宋体" w:hAnsi="宋体" w:eastAsia="宋体"/>
-                <w:sz w:val="24"/>
-              </w:rPr>
-              <w:t xml:space="preserve">附加信息：饮酒精饮料会加剧毒性影响。</w:t>
-            </w:r>
-            <w:r>
-              <w:rPr>
-                <w:rFonts w:hint="eastAsia" w:ascii="宋体" w:hAnsi="宋体" w:eastAsia="宋体"/>
-                <w:sz w:val="24"/>
-              </w:rPr>
-              <w:br w:type="textWrapping"/>
-            </w:r>
-            <w:r>
-              <w:rPr>
-                <w:rFonts w:hint="eastAsia" w:ascii="宋体" w:hAnsi="宋体" w:eastAsia="宋体"/>
-                <w:sz w:val="24"/>
-              </w:rPr>
-              <w:t xml:space="preserve">重复剂量中毒：经口；病理变化：胃，睾丸，肝，肾，红血球异常减少。</w:t>
-            </w:r>
-            <w:r>
-              <w:rPr>
-                <w:rFonts w:hint="eastAsia" w:ascii="宋体" w:hAnsi="宋体" w:eastAsia="宋体"/>
-                <w:sz w:val="24"/>
-              </w:rPr>
-              <w:br w:type="textWrapping"/>
-            </w:r>
-            <w:r>
-              <w:rPr>
-                <w:rFonts w:hint="eastAsia" w:ascii="宋体" w:hAnsi="宋体" w:eastAsia="宋体"/>
-                <w:sz w:val="24"/>
-              </w:rPr>
-              <w:t xml:space="preserve">重复剂量中毒：吸入；病理变化：肾、肝影响，视网膜损伤。</w:t>
+            <w:vAlign w:val="center"/>
+          </w:tcPr>
+          <w:p>
+            <w:pPr>
+              <w:keepNext w:val="0"/>
+              <w:keepLines w:val="0"/>
+              <w:pageBreakBefore w:val="0"/>
+              <w:widowControl w:val="0"/>
+              <w:kinsoku/>
+              <w:wordWrap/>
+              <w:overflowPunct/>
+              <w:topLinePunct w:val="0"/>
+              <w:autoSpaceDE/>
+              <w:autoSpaceDN/>
+              <w:bidi w:val="0"/>
+              <w:adjustRightInd/>
+              <w:snapToGrid/>
+              <w:spacing w:line="300" w:lineRule="auto"/>
+              <w:ind w:right="482"/>
+              <w:jc w:val="left"/>
+              <w:textAlignment w:val="auto"/>
+              <w:rPr>
+                <w:rFonts w:hint="default" w:ascii="宋体" w:hAnsi="宋体" w:eastAsia="宋体" w:cs="宋体"/>
+                <w:b/>
+                <w:bCs/>
+                <w:sz w:val="24"/>
+                <w:szCs w:val="24"/>
+                <w:lang w:val="en-US" w:eastAsia="zh-CN"/>
+              </w:rPr>
+            </w:pPr>
+            <w:r>
+              <w:rPr>
+                <w:rFonts w:hint="eastAsia"/>
+                <w:b/>
+                <w:bCs/>
+                <w:sz w:val="24"/>
+                <w:lang w:val="en-US" w:eastAsia="zh-CN"/>
+              </w:rPr>
+              <w:t>经口：</w:t>
+            </w:r>
+          </w:p>
+        </w:tc>
+        <w:tc>
+          <w:tcPr>
+            <w:tcW w:w="4951" w:type="dxa"/>
+            <w:gridSpan w:val="2"/>
+            <w:tcBorders>
+              <w:top w:val="dotted" w:color="auto" w:sz="4" w:space="0"/>
+              <w:left w:val="dotted" w:color="auto" w:sz="4" w:space="0"/>
+              <w:bottom w:val="dotted" w:color="auto" w:sz="4" w:space="0"/>
+            </w:tcBorders>
+          </w:tcPr>
+          <w:p>
+            <w:pPr>
+              <w:keepNext w:val="0"/>
+              <w:keepLines w:val="0"/>
+              <w:pageBreakBefore w:val="0"/>
+              <w:widowControl w:val="0"/>
+              <w:kinsoku/>
+              <w:wordWrap/>
+              <w:overflowPunct/>
+              <w:topLinePunct w:val="0"/>
+              <w:autoSpaceDE/>
+              <w:autoSpaceDN/>
+              <w:bidi w:val="0"/>
+              <w:adjustRightInd/>
+              <w:snapToGrid/>
+              <w:spacing w:line="300" w:lineRule="auto"/>
+              <w:ind w:right="482"/>
+              <w:jc w:val="left"/>
+              <w:textAlignment w:val="auto"/>
+              <w:rPr>
+                <w:rFonts w:hint="eastAsia"/>
+                <w:sz w:val="24"/>
+                <w:lang w:val="en-US" w:eastAsia="zh-CN"/>
+              </w:rPr>
+            </w:pPr>
+            <w:r>
+              <w:rPr>
+                <w:rFonts w:hint="eastAsia" w:eastAsia="宋体"/>
+                <w:b w:val="0"/>
+                <w:bCs w:val="0"/>
+                <w:sz w:val="24"/>
+                <w:szCs w:val="24"/>
+                <w:lang w:val="en-US" w:eastAsia="zh-CN"/>
+              </w:rPr>
+              <w:t>半数致死剂量（LD50）/大鼠：3,000－6,000mg/kg</w:t>
+            </w:r>
+          </w:p>
+        </w:tc>
+      </w:tr>
+      <w:tr>
+        <w:tblPrEx>
+          <w:tblBorders>
+            <w:top w:val="single" w:color="auto" w:sz="4" w:space="0"/>
+            <w:left w:val="single" w:color="auto" w:sz="4" w:space="0"/>
+            <w:bottom w:val="single" w:color="auto" w:sz="4" w:space="0"/>
+            <w:right w:val="single" w:color="auto" w:sz="4" w:space="0"/>
+            <w:insideH w:val="none" w:color="auto" w:sz="0" w:space="0"/>
+            <w:insideV w:val="none" w:color="auto" w:sz="0" w:space="0"/>
+          </w:tblBorders>
+          <w:tblCellMar>
+            <w:top w:w="0" w:type="dxa"/>
+            <w:left w:w="108" w:type="dxa"/>
+            <w:bottom w:w="0" w:type="dxa"/>
+            <w:right w:w="108" w:type="dxa"/>
+          </w:tblCellMar>
+        </w:tblPrEx>
+        <w:trPr>
+          <w:trHeight w:val="285" w:hRule="atLeast"/>
+        </w:trPr>
+        <w:tc>
+          <w:tcPr>
+            <w:tcW w:w="3519" w:type="dxa"/>
+            <w:vMerge w:val="continue"/>
+            <w:tcBorders>
+              <w:top w:val="dotted" w:color="auto" w:sz="4" w:space="0"/>
+              <w:bottom w:val="dotted" w:color="auto" w:sz="4" w:space="0"/>
+              <w:right w:val="dotted" w:color="auto" w:sz="4" w:space="0"/>
+            </w:tcBorders>
+            <w:vAlign w:val="center"/>
+          </w:tcPr>
+          <w:p>
+            <w:pPr>
+              <w:keepNext w:val="0"/>
+              <w:keepLines w:val="0"/>
+              <w:pageBreakBefore w:val="0"/>
+              <w:widowControl w:val="0"/>
+              <w:numPr>
+                <w:ilvl w:val="1"/>
+                <w:numId w:val="0"/>
+              </w:numPr>
+              <w:kinsoku/>
+              <w:wordWrap/>
+              <w:overflowPunct/>
+              <w:topLinePunct w:val="0"/>
+              <w:autoSpaceDE/>
+              <w:autoSpaceDN/>
+              <w:bidi w:val="0"/>
+              <w:adjustRightInd/>
+              <w:snapToGrid/>
+              <w:spacing w:line="300" w:lineRule="auto"/>
+              <w:ind w:left="599" w:leftChars="16" w:hanging="565" w:hangingChars="268"/>
+              <w:jc w:val="left"/>
+              <w:textAlignment w:val="auto"/>
+              <w:rPr>
+                <w:rFonts w:hint="default" w:ascii="Times New Roman" w:hAnsi="Times New Roman" w:eastAsia="宋体" w:cs="Times New Roman"/>
+                <w:b/>
+                <w:kern w:val="2"/>
+                <w:sz w:val="21"/>
+                <w:szCs w:val="21"/>
+                <w:lang w:val="en-US" w:eastAsia="zh-CN" w:bidi="ar-SA"/>
+              </w:rPr>
+            </w:pPr>
+          </w:p>
+        </w:tc>
+        <w:tc>
+          <w:tcPr>
+            <w:tcW w:w="1311" w:type="dxa"/>
+            <w:tcBorders>
+              <w:top w:val="dotted" w:color="auto" w:sz="4" w:space="0"/>
+              <w:left w:val="dotted" w:color="auto" w:sz="4" w:space="0"/>
+              <w:bottom w:val="dotted" w:color="auto" w:sz="4" w:space="0"/>
+              <w:right w:val="dotted" w:color="auto" w:sz="4" w:space="0"/>
+            </w:tcBorders>
+            <w:vAlign w:val="center"/>
+          </w:tcPr>
+          <w:p>
+            <w:pPr>
+              <w:keepNext w:val="0"/>
+              <w:keepLines w:val="0"/>
+              <w:pageBreakBefore w:val="0"/>
+              <w:widowControl w:val="0"/>
+              <w:kinsoku/>
+              <w:wordWrap/>
+              <w:overflowPunct/>
+              <w:topLinePunct w:val="0"/>
+              <w:autoSpaceDE/>
+              <w:autoSpaceDN/>
+              <w:bidi w:val="0"/>
+              <w:adjustRightInd/>
+              <w:snapToGrid/>
+              <w:spacing w:line="300" w:lineRule="auto"/>
+              <w:ind w:right="482"/>
+              <w:jc w:val="left"/>
+              <w:textAlignment w:val="auto"/>
+              <w:rPr>
+                <w:rFonts w:hint="eastAsia"/>
+                <w:b/>
+                <w:bCs/>
+                <w:sz w:val="24"/>
+                <w:lang w:val="en-US" w:eastAsia="zh-CN"/>
+              </w:rPr>
+            </w:pPr>
+            <w:r>
+              <w:rPr>
+                <w:rFonts w:hint="eastAsia"/>
+                <w:b/>
+                <w:bCs/>
+                <w:sz w:val="24"/>
+                <w:lang w:val="en-US" w:eastAsia="zh-CN"/>
+              </w:rPr>
+              <w:t>吸入：</w:t>
+            </w:r>
+          </w:p>
+        </w:tc>
+        <w:tc>
+          <w:tcPr>
+            <w:tcW w:w="4951" w:type="dxa"/>
+            <w:gridSpan w:val="2"/>
+            <w:tcBorders>
+              <w:top w:val="dotted" w:color="auto" w:sz="4" w:space="0"/>
+              <w:left w:val="dotted" w:color="auto" w:sz="4" w:space="0"/>
+              <w:bottom w:val="dotted" w:color="auto" w:sz="4" w:space="0"/>
+            </w:tcBorders>
+          </w:tcPr>
+          <w:p>
+            <w:pPr>
+              <w:keepNext w:val="0"/>
+              <w:keepLines w:val="0"/>
+              <w:pageBreakBefore w:val="0"/>
+              <w:widowControl w:val="0"/>
+              <w:kinsoku/>
+              <w:wordWrap/>
+              <w:overflowPunct/>
+              <w:topLinePunct w:val="0"/>
+              <w:autoSpaceDE/>
+              <w:autoSpaceDN/>
+              <w:bidi w:val="0"/>
+              <w:adjustRightInd/>
+              <w:snapToGrid/>
+              <w:spacing w:line="300" w:lineRule="auto"/>
+              <w:ind w:right="482"/>
+              <w:jc w:val="left"/>
+              <w:textAlignment w:val="auto"/>
+              <w:rPr>
+                <w:rFonts w:hint="eastAsia"/>
+                <w:sz w:val="24"/>
+                <w:lang w:val="en-US" w:eastAsia="zh-CN"/>
+              </w:rPr>
+            </w:pPr>
+            <w:r>
+              <w:rPr>
+                <w:rFonts w:hint="eastAsia" w:eastAsia="宋体"/>
+                <w:b w:val="0"/>
+                <w:bCs w:val="0"/>
+                <w:sz w:val="24"/>
+                <w:szCs w:val="24"/>
+                <w:lang w:val="en-US" w:eastAsia="zh-CN"/>
+              </w:rPr>
+              <w:t>吸入：半数致死浓度（LC50）/1h/大鼠 雌性：8.81mg/l（此值仅用于有可吸入的颗粒形成的情况。）</w:t>
+            </w:r>
+          </w:p>
+        </w:tc>
+      </w:tr>
+      <w:tr>
+        <w:tblPrEx>
+          <w:tblBorders>
+            <w:top w:val="single" w:color="auto" w:sz="4" w:space="0"/>
+            <w:left w:val="single" w:color="auto" w:sz="4" w:space="0"/>
+            <w:bottom w:val="single" w:color="auto" w:sz="4" w:space="0"/>
+            <w:right w:val="single" w:color="auto" w:sz="4" w:space="0"/>
+            <w:insideH w:val="none" w:color="auto" w:sz="0" w:space="0"/>
+            <w:insideV w:val="none" w:color="auto" w:sz="0" w:space="0"/>
+          </w:tblBorders>
+          <w:tblCellMar>
+            <w:top w:w="0" w:type="dxa"/>
+            <w:left w:w="108" w:type="dxa"/>
+            <w:bottom w:w="0" w:type="dxa"/>
+            <w:right w:w="108" w:type="dxa"/>
+          </w:tblCellMar>
+        </w:tblPrEx>
+        <w:trPr>
+          <w:trHeight w:val="285" w:hRule="atLeast"/>
+        </w:trPr>
+        <w:tc>
+          <w:tcPr>
+            <w:tcW w:w="3519" w:type="dxa"/>
+            <w:tcBorders>
+              <w:top w:val="dotted" w:color="auto" w:sz="4" w:space="0"/>
+              <w:bottom w:val="dotted" w:color="auto" w:sz="4" w:space="0"/>
+              <w:right w:val="dotted" w:color="auto" w:sz="4" w:space="0"/>
+            </w:tcBorders>
+            <w:vAlign w:val="center"/>
+          </w:tcPr>
+          <w:p>
+            <w:pPr>
+              <w:keepNext w:val="0"/>
+              <w:keepLines w:val="0"/>
+              <w:pageBreakBefore w:val="0"/>
+              <w:widowControl w:val="0"/>
+              <w:numPr>
+                <w:ilvl w:val="1"/>
+                <w:numId w:val="0"/>
+              </w:numPr>
+              <w:kinsoku/>
+              <w:wordWrap/>
+              <w:overflowPunct/>
+              <w:topLinePunct w:val="0"/>
+              <w:autoSpaceDE/>
+              <w:autoSpaceDN/>
+              <w:bidi w:val="0"/>
+              <w:adjustRightInd/>
+              <w:snapToGrid/>
+              <w:spacing w:line="300" w:lineRule="auto"/>
+              <w:ind w:left="599" w:leftChars="16" w:hanging="565" w:hangingChars="268"/>
+              <w:jc w:val="left"/>
+              <w:textAlignment w:val="auto"/>
+              <w:rPr>
+                <w:b/>
+                <w:sz w:val="24"/>
+              </w:rPr>
+            </w:pPr>
+            <w:r>
+              <w:rPr>
+                <w:rFonts w:hint="default" w:ascii="Times New Roman" w:hAnsi="Times New Roman" w:eastAsia="宋体" w:cs="Times New Roman"/>
+                <w:b w:val="1"/>
+                <w:bCs w:val="1"/>
+                <w:kern w:val="2"/>
+                <w:sz w:val="21"/>
+                <w:szCs w:val="21"/>
+                <w:lang w:val="en-US" w:eastAsia="zh-CN" w:bidi="ar-SA"/>
+              </w:rPr>
+              <w:t>11.2</w:t>
+            </w:r>
+            <w:r>
+              <w:rPr>
+                <w:rFonts w:hint="eastAsia" w:ascii="Times New Roman" w:hAnsi="Times New Roman" w:eastAsia="宋体" w:cs="Times New Roman"/>
+                <w:b w:val="1"/>
+                <w:bCs w:val="1"/>
+                <w:kern w:val="2"/>
+                <w:sz w:val="24"/>
+                <w:szCs w:val="24"/>
+                <w:lang w:val="en-US" w:eastAsia="zh-CN" w:bidi="ar-SA"/>
+              </w:rPr>
+              <w:t xml:space="preserve"> </w:t>
+            </w:r>
+            <w:r>
+              <w:rPr>
+                <w:rFonts w:hint="eastAsia" w:cs="Times New Roman" w:eastAsia="宋体"/>
+                <w:b w:val="1"/>
+                <w:bCs w:val="1"/>
+                <w:kern w:val="2"/>
+                <w:sz w:val="24"/>
+                <w:szCs w:val="24"/>
+                <w:lang w:val="en-US" w:eastAsia="zh-CN" w:bidi="ar-SA"/>
+              </w:rPr>
+              <w:t xml:space="preserve"> </w:t>
+            </w:r>
+            <w:r>
+              <w:rPr>
+                <w:rFonts w:hint="eastAsia" w:hAnsi="Arial" w:eastAsia="宋体"/>
+                <w:b w:val="1"/>
+                <w:bCs w:val="1"/>
+                <w:sz w:val="24"/>
+                <w:szCs w:val="24"/>
+              </w:rPr>
+              <w:t>原发性皮肤刺激：</w:t>
+            </w:r>
+          </w:p>
+        </w:tc>
+        <w:tc>
+          <w:tcPr>
+            <w:tcW w:w="6262" w:type="dxa"/>
+            <w:gridSpan w:val="3"/>
+            <w:tcBorders>
+              <w:top w:val="dotted" w:color="auto" w:sz="4" w:space="0"/>
+              <w:left w:val="dotted" w:color="auto" w:sz="4" w:space="0"/>
+              <w:bottom w:val="dotted" w:color="auto" w:sz="4" w:space="0"/>
+            </w:tcBorders>
+          </w:tcPr>
+          <w:p>
+            <w:pPr>
+              <w:keepNext w:val="0"/>
+              <w:keepLines w:val="0"/>
+              <w:pageBreakBefore w:val="0"/>
+              <w:widowControl w:val="0"/>
+              <w:kinsoku/>
+              <w:wordWrap/>
+              <w:overflowPunct/>
+              <w:topLinePunct w:val="0"/>
+              <w:autoSpaceDE/>
+              <w:autoSpaceDN/>
+              <w:bidi w:val="0"/>
+              <w:adjustRightInd/>
+              <w:snapToGrid/>
+              <w:spacing w:line="300" w:lineRule="auto"/>
+              <w:ind w:right="480"/>
+              <w:jc w:val="left"/>
+              <w:textAlignment w:val="auto"/>
+              <w:rPr>
+                <w:rFonts w:hint="eastAsia"/>
+                <w:sz w:val="24"/>
+                <w:lang w:val="en-US" w:eastAsia="zh-CN"/>
+              </w:rPr>
+            </w:pPr>
+            <w:r>
+              <w:rPr>
+                <w:rFonts w:hint="eastAsia" w:eastAsia="宋体"/>
+                <w:b w:val="0"/>
+                <w:bCs w:val="0"/>
+                <w:sz w:val="24"/>
+                <w:szCs w:val="24"/>
+                <w:lang w:val="en-US" w:eastAsia="zh-CN"/>
+              </w:rPr>
+              <w:t>物种：兔子；分类：刺激皮肤；结果：轻度的皮肤刺激</w:t>
+            </w:r>
+          </w:p>
+        </w:tc>
+      </w:tr>
+      <w:tr>
+        <w:tblPrEx>
+          <w:tblBorders>
+            <w:top w:val="single" w:color="auto" w:sz="4" w:space="0"/>
+            <w:left w:val="single" w:color="auto" w:sz="4" w:space="0"/>
+            <w:bottom w:val="single" w:color="auto" w:sz="4" w:space="0"/>
+            <w:right w:val="single" w:color="auto" w:sz="4" w:space="0"/>
+            <w:insideH w:val="none" w:color="auto" w:sz="0" w:space="0"/>
+            <w:insideV w:val="none" w:color="auto" w:sz="0" w:space="0"/>
+          </w:tblBorders>
+          <w:tblCellMar>
+            <w:top w:w="0" w:type="dxa"/>
+            <w:left w:w="108" w:type="dxa"/>
+            <w:bottom w:w="0" w:type="dxa"/>
+            <w:right w:w="108" w:type="dxa"/>
+          </w:tblCellMar>
+        </w:tblPrEx>
+        <w:trPr>
+          <w:trHeight w:val="285" w:hRule="atLeast"/>
+        </w:trPr>
+        <w:tc>
+          <w:tcPr>
+            <w:tcW w:w="3519" w:type="dxa"/>
+            <w:tcBorders>
+              <w:top w:val="dotted" w:color="auto" w:sz="4" w:space="0"/>
+              <w:bottom w:val="dotted" w:color="auto" w:sz="4" w:space="0"/>
+              <w:right w:val="dotted" w:color="auto" w:sz="4" w:space="0"/>
+            </w:tcBorders>
+            <w:vAlign w:val="center"/>
+          </w:tcPr>
+          <w:p>
+            <w:pPr>
+              <w:keepNext w:val="0"/>
+              <w:keepLines w:val="0"/>
+              <w:pageBreakBefore w:val="0"/>
+              <w:widowControl w:val="0"/>
+              <w:numPr>
+                <w:ilvl w:val="1"/>
+                <w:numId w:val="0"/>
+              </w:numPr>
+              <w:kinsoku/>
+              <w:wordWrap/>
+              <w:overflowPunct/>
+              <w:topLinePunct w:val="0"/>
+              <w:autoSpaceDE/>
+              <w:autoSpaceDN/>
+              <w:bidi w:val="0"/>
+              <w:adjustRightInd/>
+              <w:snapToGrid/>
+              <w:spacing w:line="300" w:lineRule="auto"/>
+              <w:ind w:left="599" w:leftChars="16" w:hanging="565" w:hangingChars="268"/>
+              <w:jc w:val="left"/>
+              <w:textAlignment w:val="auto"/>
+              <w:rPr>
+                <w:b/>
+                <w:sz w:val="24"/>
+              </w:rPr>
+            </w:pPr>
+            <w:r>
+              <w:rPr>
+                <w:rFonts w:hint="default" w:ascii="Times New Roman" w:hAnsi="Times New Roman" w:eastAsia="宋体" w:cs="Times New Roman"/>
+                <w:b w:val="1"/>
+                <w:bCs w:val="1"/>
+                <w:kern w:val="2"/>
+                <w:sz w:val="21"/>
+                <w:szCs w:val="21"/>
+                <w:lang w:val="en-US" w:eastAsia="zh-CN" w:bidi="ar-SA"/>
+              </w:rPr>
+              <w:t>11.3</w:t>
+            </w:r>
+            <w:r>
+              <w:rPr>
+                <w:rFonts w:hint="eastAsia" w:cs="Times New Roman" w:eastAsia="宋体"/>
+                <w:b w:val="1"/>
+                <w:bCs w:val="1"/>
+                <w:kern w:val="2"/>
+                <w:sz w:val="24"/>
+                <w:szCs w:val="24"/>
+                <w:lang w:val="en-US" w:eastAsia="zh-CN" w:bidi="ar-SA"/>
+              </w:rPr>
+              <w:t xml:space="preserve">  </w:t>
+            </w:r>
+            <w:r>
+              <w:rPr>
+                <w:rFonts w:hint="eastAsia" w:hAnsi="Arial" w:eastAsia="宋体"/>
+                <w:b w:val="1"/>
+                <w:bCs w:val="1"/>
+                <w:sz w:val="24"/>
+                <w:szCs w:val="24"/>
+              </w:rPr>
+              <w:t>主要</w:t>
+            </w:r>
+            <w:r>
+              <w:rPr>
+                <w:rFonts w:hint="eastAsia" w:hAnsi="Arial" w:eastAsia="宋体"/>
+                <w:b w:val="1"/>
+                <w:bCs w:val="1"/>
+                <w:sz w:val="24"/>
+                <w:szCs w:val="24"/>
+                <w:lang w:val="en-US" w:eastAsia="zh-CN"/>
+              </w:rPr>
+              <w:t>粘膜</w:t>
+            </w:r>
+            <w:r>
+              <w:rPr>
+                <w:rFonts w:hint="eastAsia" w:hAnsi="Arial" w:eastAsia="宋体"/>
+                <w:b w:val="1"/>
+                <w:bCs w:val="1"/>
+                <w:sz w:val="24"/>
+                <w:szCs w:val="24"/>
+              </w:rPr>
+              <w:t>刺激性：</w:t>
+            </w:r>
+          </w:p>
+        </w:tc>
+        <w:tc>
+          <w:tcPr>
+            <w:tcW w:w="6262" w:type="dxa"/>
+            <w:gridSpan w:val="3"/>
+            <w:tcBorders>
+              <w:top w:val="dotted" w:color="auto" w:sz="4" w:space="0"/>
+              <w:left w:val="dotted" w:color="auto" w:sz="4" w:space="0"/>
+              <w:bottom w:val="dotted" w:color="auto" w:sz="4" w:space="0"/>
+            </w:tcBorders>
+          </w:tcPr>
+          <w:p>
+            <w:pPr>
+              <w:keepNext w:val="0"/>
+              <w:keepLines w:val="0"/>
+              <w:pageBreakBefore w:val="0"/>
+              <w:widowControl w:val="0"/>
+              <w:kinsoku/>
+              <w:wordWrap/>
+              <w:overflowPunct/>
+              <w:topLinePunct w:val="0"/>
+              <w:autoSpaceDE/>
+              <w:autoSpaceDN/>
+              <w:bidi w:val="0"/>
+              <w:adjustRightInd/>
+              <w:snapToGrid/>
+              <w:spacing w:line="300" w:lineRule="auto"/>
+              <w:ind w:right="480"/>
+              <w:jc w:val="left"/>
+              <w:textAlignment w:val="auto"/>
+              <w:rPr>
+                <w:rFonts w:hint="eastAsia"/>
+                <w:sz w:val="24"/>
+                <w:lang w:val="en-US" w:eastAsia="zh-CN"/>
+              </w:rPr>
+            </w:pPr>
+            <w:r>
+              <w:rPr>
+                <w:rFonts w:hint="eastAsia" w:eastAsia="宋体"/>
+                <w:b w:val="0"/>
+                <w:bCs w:val="0"/>
+                <w:sz w:val="24"/>
+                <w:szCs w:val="24"/>
+                <w:lang w:val="en-US" w:eastAsia="zh-CN"/>
+              </w:rPr>
+              <w:t>物种：兔子；分类：刺激眼睛；结果：轻度的眼睛刺激</w:t>
+            </w:r>
+          </w:p>
+        </w:tc>
+      </w:tr>
+      <w:tr>
+        <w:tblPrEx>
+          <w:tblBorders>
+            <w:top w:val="single" w:color="auto" w:sz="4" w:space="0"/>
+            <w:left w:val="single" w:color="auto" w:sz="4" w:space="0"/>
+            <w:bottom w:val="single" w:color="auto" w:sz="4" w:space="0"/>
+            <w:right w:val="single" w:color="auto" w:sz="4" w:space="0"/>
+            <w:insideH w:val="none" w:color="auto" w:sz="0" w:space="0"/>
+            <w:insideV w:val="none" w:color="auto" w:sz="0" w:space="0"/>
+          </w:tblBorders>
+          <w:tblCellMar>
+            <w:top w:w="0" w:type="dxa"/>
+            <w:left w:w="108" w:type="dxa"/>
+            <w:bottom w:w="0" w:type="dxa"/>
+            <w:right w:w="108" w:type="dxa"/>
+          </w:tblCellMar>
+        </w:tblPrEx>
+        <w:trPr>
+          <w:trHeight w:val="1169" w:hRule="atLeast"/>
+        </w:trPr>
+        <w:tc>
+          <w:tcPr>
+            <w:tcW w:w="3519" w:type="dxa"/>
+            <w:tcBorders>
+              <w:top w:val="dotted" w:color="auto" w:sz="4" w:space="0"/>
+              <w:bottom w:val="dotted" w:color="auto" w:sz="4" w:space="0"/>
+              <w:right w:val="dotted" w:color="auto" w:sz="4" w:space="0"/>
+            </w:tcBorders>
+            <w:vAlign w:val="center"/>
+          </w:tcPr>
+          <w:p>
+            <w:pPr>
+              <w:keepNext w:val="0"/>
+              <w:keepLines w:val="0"/>
+              <w:pageBreakBefore w:val="0"/>
+              <w:widowControl w:val="0"/>
+              <w:numPr>
+                <w:ilvl w:val="1"/>
+                <w:numId w:val="0"/>
+              </w:numPr>
+              <w:kinsoku/>
+              <w:wordWrap/>
+              <w:overflowPunct/>
+              <w:topLinePunct w:val="0"/>
+              <w:autoSpaceDE/>
+              <w:autoSpaceDN/>
+              <w:bidi w:val="0"/>
+              <w:adjustRightInd/>
+              <w:snapToGrid/>
+              <w:spacing w:line="300" w:lineRule="auto"/>
+              <w:ind w:left="599" w:leftChars="16" w:hanging="565" w:hangingChars="268"/>
+              <w:jc w:val="left"/>
+              <w:textAlignment w:val="auto"/>
+              <w:rPr>
+                <w:b/>
+                <w:sz w:val="24"/>
+              </w:rPr>
+            </w:pPr>
+            <w:r>
+              <w:rPr>
+                <w:rFonts w:hint="default" w:ascii="Times New Roman" w:hAnsi="Times New Roman" w:eastAsia="宋体" w:cs="Times New Roman"/>
+                <w:b w:val="1"/>
+                <w:bCs w:val="1"/>
+                <w:kern w:val="2"/>
+                <w:sz w:val="21"/>
+                <w:szCs w:val="21"/>
+                <w:lang w:val="en-US" w:eastAsia="zh-CN" w:bidi="ar-SA"/>
+              </w:rPr>
+              <w:t>11.4</w:t>
+            </w:r>
+            <w:r>
+              <w:rPr>
+                <w:rFonts w:hint="eastAsia" w:cs="Times New Roman" w:eastAsia="宋体"/>
+                <w:b w:val="1"/>
+                <w:bCs w:val="1"/>
+                <w:kern w:val="2"/>
+                <w:sz w:val="24"/>
+                <w:szCs w:val="24"/>
+                <w:lang w:val="en-US" w:eastAsia="zh-CN" w:bidi="ar-SA"/>
+              </w:rPr>
+              <w:t xml:space="preserve">  </w:t>
+            </w:r>
+            <w:r>
+              <w:rPr>
+                <w:rFonts w:hint="eastAsia" w:hAnsi="Arial" w:eastAsia="宋体"/>
+                <w:b w:val="1"/>
+                <w:bCs w:val="1"/>
+                <w:sz w:val="24"/>
+                <w:szCs w:val="24"/>
+              </w:rPr>
+              <w:t>致敏性：</w:t>
+            </w:r>
+          </w:p>
+        </w:tc>
+        <w:tc>
+          <w:tcPr>
+            <w:tcW w:w="6262" w:type="dxa"/>
+            <w:gridSpan w:val="3"/>
+            <w:tcBorders>
+              <w:top w:val="dotted" w:color="auto" w:sz="4" w:space="0"/>
+              <w:left w:val="dotted" w:color="auto" w:sz="4" w:space="0"/>
+              <w:bottom w:val="dotted" w:color="auto" w:sz="4" w:space="0"/>
+            </w:tcBorders>
+          </w:tcPr>
+          <w:p>
+            <w:pPr>
+              <w:keepNext w:val="0"/>
+              <w:keepLines w:val="0"/>
+              <w:pageBreakBefore w:val="0"/>
+              <w:widowControl w:val="0"/>
+              <w:kinsoku/>
+              <w:wordWrap/>
+              <w:overflowPunct/>
+              <w:topLinePunct w:val="0"/>
+              <w:autoSpaceDE/>
+              <w:autoSpaceDN/>
+              <w:bidi w:val="0"/>
+              <w:adjustRightInd/>
+              <w:snapToGrid/>
+              <w:spacing w:line="300" w:lineRule="auto"/>
+              <w:ind w:right="480"/>
+              <w:jc w:val="left"/>
+              <w:textAlignment w:val="auto"/>
+              <w:rPr>
+                <w:rFonts w:hint="eastAsia"/>
+                <w:sz w:val="24"/>
+                <w:lang w:val="en-US" w:eastAsia="zh-CN"/>
+              </w:rPr>
+            </w:pPr>
+            <w:r>
+              <w:rPr>
+                <w:rFonts w:hint="eastAsia" w:eastAsia="宋体"/>
+                <w:b w:val="0"/>
+                <w:bCs w:val="0"/>
+                <w:sz w:val="24"/>
+                <w:szCs w:val="24"/>
+                <w:lang w:val="en-US" w:eastAsia="zh-CN"/>
+              </w:rPr>
+              <w:t>致敏性：物种：豚鼠；分类：不是皮肤过敏物质；结果：未引起实验室动物过敏；物种：人类；分类：不是皮肤过敏物质；结果：对志愿者做的皮肤接触试验证明没有过敏特性</w:t>
+            </w:r>
+            <w:r>
+              <w:rPr>
+                <w:rFonts w:ascii="宋体" w:hAnsi="宋体" w:eastAsia="宋体" w:cs="宋体"/>
+                <w:sz w:val="24"/>
+                <w:szCs w:val="24"/>
+              </w:rPr>
+            </w:r>
+          </w:p>
+        </w:tc>
+      </w:tr>
+      <w:tr>
+        <w:tblPrEx>
+          <w:tblBorders>
+            <w:top w:val="single" w:color="auto" w:sz="4" w:space="0"/>
+            <w:left w:val="single" w:color="auto" w:sz="4" w:space="0"/>
+            <w:bottom w:val="single" w:color="auto" w:sz="4" w:space="0"/>
+            <w:right w:val="single" w:color="auto" w:sz="4" w:space="0"/>
+            <w:insideH w:val="none" w:color="auto" w:sz="0" w:space="0"/>
+            <w:insideV w:val="none" w:color="auto" w:sz="0" w:space="0"/>
+          </w:tblBorders>
+          <w:tblCellMar>
+            <w:top w:w="0" w:type="dxa"/>
+            <w:left w:w="108" w:type="dxa"/>
+            <w:bottom w:w="0" w:type="dxa"/>
+            <w:right w:w="108" w:type="dxa"/>
+          </w:tblCellMar>
+        </w:tblPrEx>
+        <w:trPr>
+          <w:trHeight w:val="285" w:hRule="atLeast"/>
+        </w:trPr>
+        <w:tc>
+          <w:tcPr>
+            <w:tcW w:w="3519" w:type="dxa"/>
+            <w:tcBorders>
+              <w:top w:val="dotted" w:color="auto" w:sz="4" w:space="0"/>
+              <w:bottom w:val="dotted" w:color="auto" w:sz="4" w:space="0"/>
+              <w:right w:val="dotted" w:color="auto" w:sz="4" w:space="0"/>
+            </w:tcBorders>
+            <w:vAlign w:val="center"/>
+          </w:tcPr>
+          <w:p>
+            <w:pPr>
+              <w:keepNext w:val="0"/>
+              <w:keepLines w:val="0"/>
+              <w:pageBreakBefore w:val="0"/>
+              <w:widowControl w:val="0"/>
+              <w:numPr>
+                <w:ilvl w:val="1"/>
+                <w:numId w:val="0"/>
+              </w:numPr>
+              <w:kinsoku/>
+              <w:wordWrap/>
+              <w:overflowPunct/>
+              <w:topLinePunct w:val="0"/>
+              <w:autoSpaceDE/>
+              <w:autoSpaceDN/>
+              <w:bidi w:val="0"/>
+              <w:adjustRightInd/>
+              <w:snapToGrid/>
+              <w:spacing w:line="300" w:lineRule="auto"/>
+              <w:ind w:left="599" w:leftChars="16" w:hanging="565" w:hangingChars="268"/>
+              <w:jc w:val="left"/>
+              <w:textAlignment w:val="auto"/>
+              <w:rPr>
+                <w:b/>
+                <w:sz w:val="24"/>
+              </w:rPr>
+            </w:pPr>
+            <w:r>
+              <w:rPr>
+                <w:rFonts w:hint="default" w:ascii="Times New Roman" w:hAnsi="Times New Roman" w:eastAsia="宋体" w:cs="Times New Roman"/>
+                <w:b w:val="1"/>
+                <w:bCs w:val="1"/>
+                <w:kern w:val="2"/>
+                <w:sz w:val="21"/>
+                <w:szCs w:val="21"/>
+                <w:lang w:val="en-US" w:eastAsia="zh-CN" w:bidi="ar-SA"/>
+              </w:rPr>
+              <w:t>11.5</w:t>
+            </w:r>
+            <w:r>
+              <w:rPr>
+                <w:rFonts w:hint="eastAsia" w:cs="Times New Roman" w:eastAsia="宋体"/>
+                <w:b w:val="1"/>
+                <w:bCs w:val="1"/>
+                <w:kern w:val="2"/>
+                <w:sz w:val="24"/>
+                <w:szCs w:val="24"/>
+                <w:lang w:val="en-US" w:eastAsia="zh-CN" w:bidi="ar-SA"/>
+              </w:rPr>
+              <w:t xml:space="preserve">  </w:t>
+            </w:r>
+            <w:r>
+              <w:rPr>
+                <w:rFonts w:hint="eastAsia" w:hAnsi="Arial" w:eastAsia="宋体"/>
+                <w:b w:val="1"/>
+                <w:bCs w:val="1"/>
+                <w:sz w:val="24"/>
+                <w:szCs w:val="24"/>
+              </w:rPr>
+              <w:t>致突变性：</w:t>
+            </w:r>
+          </w:p>
+        </w:tc>
+        <w:tc>
+          <w:tcPr>
+            <w:tcW w:w="6262" w:type="dxa"/>
+            <w:gridSpan w:val="3"/>
+            <w:tcBorders>
+              <w:top w:val="dotted" w:color="auto" w:sz="4" w:space="0"/>
+              <w:left w:val="dotted" w:color="auto" w:sz="4" w:space="0"/>
+              <w:bottom w:val="dotted" w:color="auto" w:sz="4" w:space="0"/>
+            </w:tcBorders>
+          </w:tcPr>
+          <w:p>
+            <w:pPr>
+              <w:keepNext w:val="0"/>
+              <w:keepLines w:val="0"/>
+              <w:pageBreakBefore w:val="0"/>
+              <w:widowControl w:val="0"/>
+              <w:kinsoku/>
+              <w:wordWrap/>
+              <w:overflowPunct/>
+              <w:topLinePunct w:val="0"/>
+              <w:autoSpaceDE/>
+              <w:autoSpaceDN/>
+              <w:bidi w:val="0"/>
+              <w:adjustRightInd/>
+              <w:snapToGrid/>
+              <w:spacing w:line="300" w:lineRule="auto"/>
+              <w:ind w:left="0" w:leftChars="0" w:right="0"/>
+              <w:jc w:val="left"/>
+              <w:textAlignment w:val="auto"/>
+              <w:rPr>
+                <w:rFonts w:hint="default" w:hAnsi="Arial"/>
+                <w:sz w:val="24"/>
+                <w:lang w:val="en-US" w:eastAsia="zh-CN"/>
+              </w:rPr>
+            </w:pPr>
+            <w:r>
+              <w:rPr>
+                <w:rFonts w:ascii="宋体" w:hAnsi="宋体" w:eastAsia="宋体" w:cs="宋体"/>
+                <w:b w:val="0"/>
+                <w:bCs w:val="0"/>
+                <w:sz w:val="24"/>
+                <w:szCs w:val="24"/>
+              </w:rPr>
+              <w:t>在细菌细胞培养中没有引起基因损害。在哺乳类细胞培养中没有引起基因损害。有证据认为此物质不会在动物中引起基因损伤。</w:t>
+            </w:r>
+          </w:p>
+        </w:tc>
+      </w:tr>
+      <w:tr>
+        <w:tblPrEx>
+          <w:tblBorders>
+            <w:top w:val="single" w:color="auto" w:sz="4" w:space="0"/>
+            <w:left w:val="single" w:color="auto" w:sz="4" w:space="0"/>
+            <w:bottom w:val="single" w:color="auto" w:sz="4" w:space="0"/>
+            <w:right w:val="single" w:color="auto" w:sz="4" w:space="0"/>
+            <w:insideH w:val="none" w:color="auto" w:sz="0" w:space="0"/>
+            <w:insideV w:val="none" w:color="auto" w:sz="0" w:space="0"/>
+          </w:tblBorders>
+          <w:tblCellMar>
+            <w:top w:w="0" w:type="dxa"/>
+            <w:left w:w="108" w:type="dxa"/>
+            <w:bottom w:w="0" w:type="dxa"/>
+            <w:right w:w="108" w:type="dxa"/>
+          </w:tblCellMar>
+        </w:tblPrEx>
+        <w:trPr>
+          <w:trHeight w:val="285" w:hRule="atLeast"/>
+        </w:trPr>
+        <w:tc>
+          <w:tcPr>
+            <w:tcW w:w="3519" w:type="dxa"/>
+            <w:tcBorders>
+              <w:top w:val="dotted" w:color="auto" w:sz="4" w:space="0"/>
+              <w:bottom w:val="dotted" w:color="auto" w:sz="4" w:space="0"/>
+              <w:right w:val="dotted" w:color="auto" w:sz="4" w:space="0"/>
+            </w:tcBorders>
+            <w:vAlign w:val="center"/>
+          </w:tcPr>
+          <w:p>
+            <w:pPr>
+              <w:keepNext w:val="0"/>
+              <w:keepLines w:val="0"/>
+              <w:pageBreakBefore w:val="0"/>
+              <w:widowControl w:val="0"/>
+              <w:numPr>
+                <w:ilvl w:val="1"/>
+                <w:numId w:val="0"/>
+              </w:numPr>
+              <w:kinsoku/>
+              <w:wordWrap/>
+              <w:overflowPunct/>
+              <w:topLinePunct w:val="0"/>
+              <w:autoSpaceDE/>
+              <w:autoSpaceDN/>
+              <w:bidi w:val="0"/>
+              <w:adjustRightInd/>
+              <w:snapToGrid/>
+              <w:spacing w:line="300" w:lineRule="auto"/>
+              <w:ind w:left="599" w:leftChars="16" w:hanging="565" w:hangingChars="268"/>
+              <w:jc w:val="left"/>
+              <w:textAlignment w:val="auto"/>
+              <w:rPr>
+                <w:rFonts w:hint="eastAsia" w:hAnsi="Arial"/>
+                <w:b/>
+                <w:sz w:val="24"/>
+              </w:rPr>
+            </w:pPr>
+            <w:r>
+              <w:rPr>
+                <w:rFonts w:hint="default" w:ascii="Times New Roman" w:hAnsi="Times New Roman" w:eastAsia="宋体" w:cs="Times New Roman"/>
+                <w:b w:val="1"/>
+                <w:bCs w:val="1"/>
+                <w:kern w:val="2"/>
+                <w:sz w:val="21"/>
+                <w:szCs w:val="21"/>
+                <w:lang w:val="en-US" w:eastAsia="zh-CN" w:bidi="ar-SA"/>
+              </w:rPr>
+              <w:t>11.6</w:t>
+            </w:r>
+            <w:r>
+              <w:rPr>
+                <w:rFonts w:hint="eastAsia" w:cs="Times New Roman" w:eastAsia="宋体"/>
+                <w:b w:val="1"/>
+                <w:bCs w:val="1"/>
+                <w:kern w:val="2"/>
+                <w:sz w:val="24"/>
+                <w:szCs w:val="24"/>
+                <w:lang w:val="en-US" w:eastAsia="zh-CN" w:bidi="ar-SA"/>
+              </w:rPr>
+              <w:t xml:space="preserve">  </w:t>
+            </w:r>
+            <w:r>
+              <w:rPr>
+                <w:rFonts w:hint="eastAsia" w:hAnsi="Arial" w:eastAsia="宋体"/>
+                <w:b w:val="1"/>
+                <w:bCs w:val="1"/>
+                <w:sz w:val="24"/>
+                <w:szCs w:val="24"/>
+                <w:lang w:val="en-US" w:eastAsia="zh-CN"/>
+              </w:rPr>
+              <w:t>致癌性：</w:t>
+            </w:r>
+          </w:p>
+        </w:tc>
+        <w:tc>
+          <w:tcPr>
+            <w:tcW w:w="6262" w:type="dxa"/>
+            <w:gridSpan w:val="3"/>
+            <w:tcBorders>
+              <w:top w:val="dotted" w:color="auto" w:sz="4" w:space="0"/>
+              <w:left w:val="dotted" w:color="auto" w:sz="4" w:space="0"/>
+              <w:bottom w:val="dotted" w:color="auto" w:sz="4" w:space="0"/>
+            </w:tcBorders>
+          </w:tcPr>
+          <w:p>
+            <w:pPr>
+              <w:keepNext w:val="0"/>
+              <w:keepLines w:val="0"/>
+              <w:pageBreakBefore w:val="0"/>
+              <w:widowControl w:val="0"/>
+              <w:kinsoku/>
+              <w:wordWrap/>
+              <w:overflowPunct/>
+              <w:topLinePunct w:val="0"/>
+              <w:autoSpaceDE/>
+              <w:autoSpaceDN/>
+              <w:bidi w:val="0"/>
+              <w:adjustRightInd/>
+              <w:snapToGrid/>
+              <w:spacing w:line="300" w:lineRule="auto"/>
+              <w:ind w:right="0"/>
+              <w:jc w:val="left"/>
+              <w:textAlignment w:val="auto"/>
+              <w:rPr>
+                <w:rFonts w:hint="default" w:hAnsi="Arial"/>
+                <w:sz w:val="24"/>
+                <w:lang w:val="en-US" w:eastAsia="zh-CN"/>
+              </w:rPr>
+            </w:pPr>
+            <w:r>
+              <w:rPr>
+                <w:rFonts w:hint="eastAsia" w:hAnsi="Arial" w:eastAsia="宋体"/>
+                <w:b w:val="0"/>
+                <w:bCs w:val="0"/>
+                <w:sz w:val="24"/>
+                <w:szCs w:val="24"/>
+                <w:lang w:val="en-US" w:eastAsia="zh-CN"/>
+              </w:rPr>
+              <w:t>致癌性：在动物试验中未见致癌影响。</w:t>
+            </w:r>
+          </w:p>
+        </w:tc>
+      </w:tr>
+      <w:tr>
+        <w:tblPrEx>
+          <w:tblBorders>
+            <w:top w:val="single" w:color="auto" w:sz="4" w:space="0"/>
+            <w:left w:val="single" w:color="auto" w:sz="4" w:space="0"/>
+            <w:bottom w:val="single" w:color="auto" w:sz="4" w:space="0"/>
+            <w:right w:val="single" w:color="auto" w:sz="4" w:space="0"/>
+            <w:insideH w:val="none" w:color="auto" w:sz="0" w:space="0"/>
+            <w:insideV w:val="none" w:color="auto" w:sz="0" w:space="0"/>
+          </w:tblBorders>
+          <w:tblCellMar>
+            <w:top w:w="0" w:type="dxa"/>
+            <w:left w:w="108" w:type="dxa"/>
+            <w:bottom w:w="0" w:type="dxa"/>
+            <w:right w:w="108" w:type="dxa"/>
+          </w:tblCellMar>
+        </w:tblPrEx>
+        <w:trPr>
+          <w:trHeight w:val="285" w:hRule="atLeast"/>
+        </w:trPr>
+        <w:tc>
+          <w:tcPr>
+            <w:tcW w:w="3519" w:type="dxa"/>
+            <w:tcBorders>
+              <w:top w:val="dotted" w:color="auto" w:sz="4" w:space="0"/>
+              <w:bottom w:val="dotted" w:color="auto" w:sz="4" w:space="0"/>
+              <w:right w:val="dotted" w:color="auto" w:sz="4" w:space="0"/>
+            </w:tcBorders>
+            <w:vAlign w:val="center"/>
+          </w:tcPr>
+          <w:p>
+            <w:pPr>
+              <w:keepNext w:val="0"/>
+              <w:keepLines w:val="0"/>
+              <w:pageBreakBefore w:val="0"/>
+              <w:widowControl w:val="0"/>
+              <w:numPr>
+                <w:ilvl w:val="1"/>
+                <w:numId w:val="0"/>
+              </w:numPr>
+              <w:kinsoku/>
+              <w:wordWrap/>
+              <w:overflowPunct/>
+              <w:topLinePunct w:val="0"/>
+              <w:autoSpaceDE/>
+              <w:autoSpaceDN/>
+              <w:bidi w:val="0"/>
+              <w:adjustRightInd/>
+              <w:snapToGrid/>
+              <w:spacing w:line="300" w:lineRule="auto"/>
+              <w:jc w:val="left"/>
+              <w:textAlignment w:val="auto"/>
+              <w:rPr>
+                <w:rFonts w:hint="eastAsia" w:hAnsi="Arial"/>
+                <w:b/>
+                <w:sz w:val="24"/>
+              </w:rPr>
+              <w:ind w:left="420" w:leftChars="0" w:hanging="420" w:firstLineChars="0"/>
+            </w:pPr>
+            <w:r>
+              <w:rPr>
+                <w:rFonts w:hint="default" w:ascii="Times New Roman" w:hAnsi="Times New Roman" w:eastAsia="宋体" w:cs="Times New Roman"/>
+                <w:b w:val="1"/>
+                <w:bCs w:val="1"/>
+                <w:kern w:val="2"/>
+                <w:sz w:val="21"/>
+                <w:szCs w:val="21"/>
+                <w:lang w:val="en-US" w:eastAsia="zh-CN" w:bidi="ar-SA"/>
+              </w:rPr>
+              <w:t>11.7</w:t>
+            </w:r>
+            <w:r>
+              <w:rPr>
+                <w:rFonts w:hint="eastAsia" w:cs="Times New Roman" w:eastAsia="宋体"/>
+                <w:b w:val="1"/>
+                <w:bCs w:val="1"/>
+                <w:kern w:val="2"/>
+                <w:sz w:val="24"/>
+                <w:szCs w:val="24"/>
+                <w:lang w:val="en-US" w:eastAsia="zh-CN" w:bidi="ar-SA"/>
+              </w:rPr>
+              <w:t xml:space="preserve">  </w:t>
+            </w:r>
+            <w:r>
+              <w:rPr>
+                <w:rFonts w:hint="eastAsia" w:hAnsi="Arial" w:eastAsia="宋体"/>
+                <w:b w:val="1"/>
+                <w:bCs w:val="1"/>
+                <w:sz w:val="24"/>
+                <w:szCs w:val="24"/>
+                <w:lang w:val="en-US" w:eastAsia="zh-CN"/>
+              </w:rPr>
+              <w:t>生殖毒性：</w:t>
+            </w:r>
+          </w:p>
+        </w:tc>
+        <w:tc>
+          <w:tcPr>
+            <w:tcW w:w="6262" w:type="dxa"/>
+            <w:tcBorders>
+              <w:top w:val="dotted" w:color="auto" w:sz="4" w:space="0"/>
+              <w:left w:val="dotted" w:color="auto" w:sz="4" w:space="0"/>
+              <w:bottom w:val="dotted" w:color="auto" w:sz="4" w:space="0"/>
+            </w:tcBorders>
+            <w:gridSpan w:val="3"/>
+          </w:tcPr>
+          <w:p>
+            <w:pPr>
+              <w:keepNext w:val="0"/>
+              <w:keepLines w:val="0"/>
+              <w:pageBreakBefore w:val="0"/>
+              <w:widowControl w:val="0"/>
+              <w:kinsoku/>
+              <w:wordWrap/>
+              <w:overflowPunct/>
+              <w:topLinePunct w:val="0"/>
+              <w:autoSpaceDE/>
+              <w:autoSpaceDN/>
+              <w:bidi w:val="0"/>
+              <w:adjustRightInd/>
+              <w:snapToGrid/>
+              <w:spacing w:line="300" w:lineRule="auto"/>
+              <w:ind w:right="0"/>
+              <w:jc w:val="left"/>
+              <w:textAlignment w:val="auto"/>
+              <w:rPr>
+                <w:rFonts w:ascii="宋体" w:hAnsi="宋体" w:eastAsia="宋体" w:cs="宋体"/>
+                <w:sz w:val="24"/>
+                <w:szCs w:val="24"/>
+              </w:rPr>
+            </w:pPr>
+            <w:r>
+              <w:rPr>
+                <w:rFonts w:eastAsia="宋体"/>
+                <w:b w:val="0"/>
+                <w:bCs w:val="0"/>
+                <w:sz w:val="24"/>
+                <w:szCs w:val="24"/>
+              </w:rPr>
+              <w:t>动物试验表明无生殖毒性。动物实验表明在低于那些引起母体中毒的量时，对胚胎有影响。降低了胚胎胎儿的成活力，胎儿发育缓慢（变异），胎儿畸形。</w:t>
+            </w:r>
+          </w:p>
+        </w:tc>
+      </w:tr>
+      <w:tr>
+        <w:tblPrEx>
+          <w:tblBorders>
+            <w:top w:val="single" w:color="auto" w:sz="4" w:space="0"/>
+            <w:left w:val="single" w:color="auto" w:sz="4" w:space="0"/>
+            <w:bottom w:val="single" w:color="auto" w:sz="4" w:space="0"/>
+            <w:right w:val="single" w:color="auto" w:sz="4" w:space="0"/>
+            <w:insideH w:val="none" w:color="auto" w:sz="0" w:space="0"/>
+            <w:insideV w:val="none" w:color="auto" w:sz="0" w:space="0"/>
+          </w:tblBorders>
+          <w:tblCellMar>
+            <w:top w:w="0" w:type="dxa"/>
+            <w:left w:w="108" w:type="dxa"/>
+            <w:bottom w:w="0" w:type="dxa"/>
+            <w:right w:w="108" w:type="dxa"/>
+          </w:tblCellMar>
+        </w:tblPrEx>
+        <w:trPr>
+          <w:trHeight w:val="285" w:hRule="atLeast"/>
+        </w:trPr>
+        <w:tc>
+          <w:tcPr>
+            <w:tcW w:w="3519" w:type="dxa"/>
+            <w:tcBorders>
+              <w:top w:val="dotted" w:color="auto" w:sz="4" w:space="0"/>
+              <w:bottom w:val="dotted" w:color="auto" w:sz="4" w:space="0"/>
+              <w:right w:val="dotted" w:color="auto" w:sz="4" w:space="0"/>
+            </w:tcBorders>
+            <w:vAlign w:val="center"/>
+          </w:tcPr>
+          <w:p>
+            <w:pPr>
+              <w:keepNext w:val="0"/>
+              <w:keepLines w:val="0"/>
+              <w:pageBreakBefore w:val="0"/>
+              <w:widowControl w:val="0"/>
+              <w:numPr>
+                <w:ilvl w:val="1"/>
+                <w:numId w:val="0"/>
+              </w:numPr>
+              <w:kinsoku/>
+              <w:wordWrap/>
+              <w:overflowPunct/>
+              <w:topLinePunct w:val="0"/>
+              <w:autoSpaceDE/>
+              <w:autoSpaceDN/>
+              <w:bidi w:val="0"/>
+              <w:adjustRightInd/>
+              <w:snapToGrid/>
+              <w:spacing w:line="300" w:lineRule="auto"/>
+              <w:ind w:left="599" w:leftChars="16" w:hanging="565" w:hangingChars="268"/>
+              <w:jc w:val="left"/>
+              <w:textAlignment w:val="auto"/>
+              <w:rPr>
+                <w:rFonts w:hint="eastAsia" w:hAnsi="Arial"/>
+                <w:b/>
+                <w:sz w:val="24"/>
+                <w:lang w:val="en-US" w:eastAsia="zh-CN"/>
+              </w:rPr>
+            </w:pPr>
+            <w:r>
+              <w:rPr>
+                <w:rFonts w:hint="default" w:ascii="Times New Roman" w:hAnsi="Times New Roman" w:eastAsia="宋体" w:cs="Times New Roman"/>
+                <w:b w:val="1"/>
+                <w:bCs w:val="1"/>
+                <w:kern w:val="2"/>
+                <w:sz w:val="21"/>
+                <w:szCs w:val="21"/>
+                <w:lang w:val="en-US" w:eastAsia="zh-CN" w:bidi="ar-SA"/>
+              </w:rPr>
+              <w:t>11.8</w:t>
+            </w:r>
+            <w:r>
+              <w:rPr>
+                <w:rFonts w:hint="eastAsia" w:cs="Times New Roman" w:eastAsia="宋体"/>
+                <w:b w:val="1"/>
+                <w:bCs w:val="1"/>
+                <w:kern w:val="2"/>
+                <w:sz w:val="24"/>
+                <w:szCs w:val="24"/>
+                <w:lang w:val="en-US" w:eastAsia="zh-CN" w:bidi="ar-SA"/>
+              </w:rPr>
+              <w:t xml:space="preserve">  </w:t>
+            </w:r>
+            <w:r>
+              <w:rPr>
+                <w:rFonts w:hint="eastAsia" w:hAnsi="Arial" w:eastAsia="宋体"/>
+                <w:b w:val="1"/>
+                <w:bCs w:val="1"/>
+                <w:sz w:val="24"/>
+                <w:szCs w:val="24"/>
+                <w:lang w:val="en-US" w:eastAsia="zh-CN"/>
+              </w:rPr>
+              <w:t>特异性靶器官系统毒性（一次接触/反复接触）：</w:t>
+            </w:r>
+          </w:p>
+        </w:tc>
+        <w:tc>
+          <w:tcPr>
+            <w:tcW w:w="6262" w:type="dxa"/>
+            <w:gridSpan w:val="3"/>
+            <w:tcBorders>
+              <w:top w:val="dotted" w:color="auto" w:sz="4" w:space="0"/>
+              <w:left w:val="dotted" w:color="auto" w:sz="4" w:space="0"/>
+              <w:bottom w:val="dotted" w:color="auto" w:sz="4" w:space="0"/>
+            </w:tcBorders>
+            <w:vAlign w:val="center"/>
+          </w:tcPr>
+          <w:p>
+            <w:pPr>
+              <w:keepNext w:val="0"/>
+              <w:keepLines w:val="0"/>
+              <w:pageBreakBefore w:val="0"/>
+              <w:widowControl w:val="0"/>
+              <w:kinsoku/>
+              <w:wordWrap/>
+              <w:overflowPunct/>
+              <w:topLinePunct w:val="0"/>
+              <w:autoSpaceDE/>
+              <w:autoSpaceDN/>
+              <w:bidi w:val="0"/>
+              <w:adjustRightInd/>
+              <w:snapToGrid/>
+              <w:spacing w:line="300" w:lineRule="auto"/>
+              <w:ind w:right="0"/>
+              <w:jc w:val="left"/>
+              <w:textAlignment w:val="auto"/>
+              <w:rPr>
+                <w:rFonts w:hint="default" w:hAnsi="Arial"/>
+                <w:sz w:val="24"/>
+                <w:lang w:val="en-US" w:eastAsia="zh-CN"/>
+              </w:rPr>
+            </w:pPr>
+            <w:r>
+              <w:rPr>
+                <w:rFonts w:ascii="宋体" w:hAnsi="宋体" w:eastAsia="宋体" w:cs="宋体"/>
+                <w:b w:val="0"/>
+                <w:bCs w:val="0"/>
+                <w:sz w:val="24"/>
+                <w:szCs w:val="24"/>
+              </w:rPr>
+              <w:t>特异性靶器官系统毒性（一次接触/反复接触）：无数据资料。</w:t>
+            </w:r>
+          </w:p>
+        </w:tc>
+      </w:tr>
+      <w:tr>
+        <w:tblPrEx>
+          <w:tblBorders>
+            <w:top w:val="single" w:color="auto" w:sz="4" w:space="0"/>
+            <w:left w:val="single" w:color="auto" w:sz="4" w:space="0"/>
+            <w:bottom w:val="single" w:color="auto" w:sz="4" w:space="0"/>
+            <w:right w:val="single" w:color="auto" w:sz="4" w:space="0"/>
+            <w:insideH w:val="none" w:color="auto" w:sz="0" w:space="0"/>
+            <w:insideV w:val="none" w:color="auto" w:sz="0" w:space="0"/>
+          </w:tblBorders>
+          <w:tblCellMar>
+            <w:top w:w="0" w:type="dxa"/>
+            <w:left w:w="108" w:type="dxa"/>
+            <w:bottom w:w="0" w:type="dxa"/>
+            <w:right w:w="108" w:type="dxa"/>
+          </w:tblCellMar>
+        </w:tblPrEx>
+        <w:trPr>
+          <w:trHeight w:val="285" w:hRule="atLeast"/>
+        </w:trPr>
+        <w:tc>
+          <w:tcPr>
+            <w:tcW w:w="3519" w:type="dxa"/>
+            <w:tcBorders>
+              <w:top w:val="dotted" w:color="auto" w:sz="4" w:space="0"/>
+              <w:bottom w:val="dotted" w:color="auto" w:sz="4" w:space="0"/>
+              <w:right w:val="dotted" w:color="auto" w:sz="4" w:space="0"/>
+            </w:tcBorders>
+            <w:vAlign w:val="center"/>
+          </w:tcPr>
+          <w:p>
+            <w:pPr>
+              <w:keepNext w:val="0"/>
+              <w:keepLines w:val="0"/>
+              <w:pageBreakBefore w:val="0"/>
+              <w:widowControl w:val="0"/>
+              <w:numPr>
+                <w:ilvl w:val="1"/>
+                <w:numId w:val="0"/>
+              </w:numPr>
+              <w:kinsoku/>
+              <w:wordWrap/>
+              <w:overflowPunct/>
+              <w:topLinePunct w:val="0"/>
+              <w:autoSpaceDE/>
+              <w:autoSpaceDN/>
+              <w:bidi w:val="0"/>
+              <w:adjustRightInd/>
+              <w:snapToGrid/>
+              <w:spacing w:line="300" w:lineRule="auto"/>
+              <w:ind w:left="599" w:leftChars="16" w:hanging="565" w:hangingChars="268"/>
+              <w:jc w:val="left"/>
+              <w:textAlignment w:val="auto"/>
+              <w:rPr>
+                <w:rFonts w:hint="eastAsia" w:hAnsi="Arial"/>
+                <w:b/>
+                <w:sz w:val="24"/>
+                <w:lang w:val="en-US" w:eastAsia="zh-CN"/>
+              </w:rPr>
+            </w:pPr>
+            <w:r>
+              <w:rPr>
+                <w:rFonts w:hint="default" w:ascii="Times New Roman" w:hAnsi="Times New Roman" w:eastAsia="宋体" w:cs="Times New Roman"/>
+                <w:b w:val="1"/>
+                <w:bCs w:val="1"/>
+                <w:kern w:val="2"/>
+                <w:sz w:val="21"/>
+                <w:szCs w:val="21"/>
+                <w:lang w:val="en-US" w:eastAsia="zh-CN" w:bidi="ar-SA"/>
+              </w:rPr>
+              <w:t>11.9</w:t>
+            </w:r>
+            <w:r>
+              <w:rPr>
+                <w:rFonts w:hint="eastAsia" w:cs="Times New Roman" w:eastAsia="宋体"/>
+                <w:b w:val="1"/>
+                <w:bCs w:val="1"/>
+                <w:kern w:val="2"/>
+                <w:sz w:val="24"/>
+                <w:szCs w:val="24"/>
+                <w:lang w:val="en-US" w:eastAsia="zh-CN" w:bidi="ar-SA"/>
+              </w:rPr>
+              <w:t xml:space="preserve">  </w:t>
+            </w:r>
+            <w:r>
+              <w:rPr>
+                <w:rFonts w:hint="eastAsia" w:hAnsi="Arial" w:eastAsia="宋体"/>
+                <w:b w:val="1"/>
+                <w:bCs w:val="1"/>
+                <w:sz w:val="24"/>
+                <w:szCs w:val="24"/>
+                <w:lang w:val="en-US" w:eastAsia="zh-CN"/>
+              </w:rPr>
+              <w:t xml:space="preserve">吸入危险：</w:t>
+            </w:r>
+          </w:p>
+        </w:tc>
+        <w:tc>
+          <w:tcPr>
+            <w:tcW w:w="6262" w:type="dxa"/>
+            <w:gridSpan w:val="3"/>
+            <w:tcBorders>
+              <w:top w:val="dotted" w:color="auto" w:sz="4" w:space="0"/>
+              <w:left w:val="dotted" w:color="auto" w:sz="4" w:space="0"/>
+              <w:bottom w:val="dotted" w:color="auto" w:sz="4" w:space="0"/>
+            </w:tcBorders>
+          </w:tcPr>
+          <w:p>
+            <w:pPr>
+              <w:keepNext w:val="0"/>
+              <w:keepLines w:val="0"/>
+              <w:pageBreakBefore w:val="0"/>
+              <w:widowControl w:val="0"/>
+              <w:kinsoku/>
+              <w:wordWrap/>
+              <w:overflowPunct/>
+              <w:topLinePunct w:val="0"/>
+              <w:autoSpaceDE/>
+              <w:autoSpaceDN/>
+              <w:bidi w:val="0"/>
+              <w:adjustRightInd/>
+              <w:snapToGrid/>
+              <w:spacing w:line="300" w:lineRule="auto"/>
+              <w:ind w:right="0"/>
+              <w:jc w:val="left"/>
+              <w:textAlignment w:val="auto"/>
+              <w:rPr>
+                <w:rFonts w:hint="eastAsia" w:hAnsi="Arial"/>
+                <w:sz w:val="24"/>
+                <w:lang w:val="en-US" w:eastAsia="zh-CN"/>
+              </w:rPr>
+            </w:pPr>
+            <w:r>
+              <w:rPr>
+                <w:rFonts w:hint="eastAsia" w:hAnsi="Arial" w:eastAsia="宋体"/>
+                <w:b w:val="0"/>
+                <w:bCs w:val="0"/>
+                <w:sz w:val="24"/>
+                <w:szCs w:val="24"/>
+                <w:lang w:val="en-US" w:eastAsia="zh-CN"/>
+              </w:rPr>
+              <w:t>无数据资料。</w:t>
+            </w:r>
+          </w:p>
+        </w:tc>
+      </w:tr>
+      <w:tr>
+        <w:tblPrEx>
+          <w:tblBorders>
+            <w:top w:val="single" w:color="auto" w:sz="4" w:space="0"/>
+            <w:left w:val="single" w:color="auto" w:sz="4" w:space="0"/>
+            <w:bottom w:val="single" w:color="auto" w:sz="4" w:space="0"/>
+            <w:right w:val="single" w:color="auto" w:sz="4" w:space="0"/>
+            <w:insideH w:val="none" w:color="auto" w:sz="0" w:space="0"/>
+            <w:insideV w:val="none" w:color="auto" w:sz="0" w:space="0"/>
+          </w:tblBorders>
+          <w:tblCellMar>
+            <w:top w:w="0" w:type="dxa"/>
+            <w:left w:w="108" w:type="dxa"/>
+            <w:bottom w:w="0" w:type="dxa"/>
+            <w:right w:w="108" w:type="dxa"/>
+          </w:tblCellMar>
+        </w:tblPrEx>
+        <w:trPr>
+          <w:trHeight w:val="441" w:hRule="atLeast"/>
+        </w:trPr>
+        <w:tc>
+          <w:tcPr>
+            <w:tcW w:w="3519" w:type="dxa"/>
+            <w:tcBorders>
+              <w:top w:val="dotted" w:color="auto" w:sz="4" w:space="0"/>
+              <w:right w:val="dotted" w:color="auto" w:sz="4" w:space="0"/>
+            </w:tcBorders>
+            <w:vAlign w:val="center"/>
+          </w:tcPr>
+          <w:p>
+            <w:pPr>
+              <w:keepNext w:val="0"/>
+              <w:keepLines w:val="0"/>
+              <w:pageBreakBefore w:val="0"/>
+              <w:widowControl w:val="0"/>
+              <w:numPr>
+                <w:ilvl w:val="1"/>
+                <w:numId w:val="0"/>
+              </w:numPr>
+              <w:kinsoku/>
+              <w:wordWrap/>
+              <w:overflowPunct/>
+              <w:topLinePunct w:val="0"/>
+              <w:autoSpaceDE/>
+              <w:autoSpaceDN/>
+              <w:bidi w:val="0"/>
+              <w:adjustRightInd/>
+              <w:snapToGrid/>
+              <w:spacing w:line="300" w:lineRule="auto"/>
+              <w:ind w:left="599" w:leftChars="16" w:hanging="565" w:hangingChars="268"/>
+              <w:jc w:val="left"/>
+              <w:textAlignment w:val="auto"/>
+              <w:rPr>
+                <w:rFonts w:hint="eastAsia" w:hAnsi="Arial"/>
+                <w:b/>
+                <w:sz w:val="24"/>
+                <w:lang w:val="en-US" w:eastAsia="zh-CN"/>
+              </w:rPr>
+            </w:pPr>
+            <w:r>
+              <w:rPr>
+                <w:rFonts w:hint="default" w:ascii="Times New Roman" w:hAnsi="Times New Roman" w:eastAsia="宋体" w:cs="Times New Roman"/>
+                <w:b/>
+                <w:kern w:val="2"/>
+                <w:sz w:val="21"/>
+                <w:szCs w:val="21"/>
+                <w:lang w:val="en-US" w:eastAsia="zh-CN" w:bidi="ar-SA"/>
+              </w:rPr>
+              <w:t>11.10</w:t>
+            </w:r>
+            <w:r>
+              <w:rPr>
+                <w:rFonts w:hint="eastAsia" w:cs="Times New Roman"/>
+                <w:b/>
+                <w:kern w:val="2"/>
+                <w:sz w:val="21"/>
+                <w:szCs w:val="21"/>
+                <w:lang w:val="en-US" w:eastAsia="zh-CN" w:bidi="ar-SA"/>
+              </w:rPr>
+              <w:t xml:space="preserve"> </w:t>
+            </w:r>
+            <w:r>
+              <w:rPr>
+                <w:rFonts w:hint="eastAsia" w:hAnsi="Arial"/>
+                <w:b/>
+                <w:sz w:val="24"/>
+                <w:lang w:val="en-US" w:eastAsia="zh-CN"/>
+              </w:rPr>
+              <w:t>附加信息：</w:t>
+            </w:r>
+          </w:p>
+        </w:tc>
+        <w:tc>
+          <w:tcPr>
+            <w:tcW w:w="6262" w:type="dxa"/>
+            <w:gridSpan w:val="3"/>
+            <w:tcBorders>
+              <w:top w:val="dotted" w:color="auto" w:sz="4" w:space="0"/>
+              <w:left w:val="dotted" w:color="auto" w:sz="4" w:space="0"/>
+            </w:tcBorders>
+          </w:tcPr>
+          <w:p>
+            <w:pPr>
+              <w:keepNext w:val="0"/>
+              <w:keepLines w:val="0"/>
+              <w:pageBreakBefore w:val="0"/>
+              <w:widowControl w:val="0"/>
+              <w:kinsoku/>
+              <w:wordWrap/>
+              <w:overflowPunct/>
+              <w:topLinePunct w:val="0"/>
+              <w:autoSpaceDE/>
+              <w:autoSpaceDN/>
+              <w:bidi w:val="0"/>
+              <w:adjustRightInd/>
+              <w:snapToGrid/>
+              <w:spacing w:line="300" w:lineRule="auto"/>
+              <w:ind w:right="0"/>
+              <w:jc w:val="left"/>
+              <w:textAlignment w:val="auto"/>
+              <w:rPr>
+                <w:rFonts w:ascii="宋体" w:hAnsi="宋体" w:eastAsia="宋体" w:cs="宋体"/>
+                <w:sz w:val="24"/>
+                <w:szCs w:val="24"/>
+              </w:rPr>
+            </w:pPr>
+            <w:r>
+              <w:rPr>
+                <w:rFonts w:ascii="宋体" w:hAnsi="宋体" w:eastAsia="宋体" w:cs="宋体"/>
+                <w:b w:val="0"/>
+                <w:bCs w:val="0"/>
+                <w:sz w:val="24"/>
+                <w:szCs w:val="24"/>
+              </w:rPr>
+              <w:t/>
             </w:r>
           </w:p>
         </w:tc>

</xml_diff>

<commit_message>
fix(s11): implement structured toxicology typography, preamble styles and zero-null assertions
</commit_message>
<xml_diff>
--- a/算法训练材料/PU-202A/PU-202A msds_CN 冠志.docx
+++ b/算法训练材料/PU-202A/PU-202A msds_CN 冠志.docx
@@ -10260,7 +10260,25 @@
         </w:tc>
       </w:tr>
       <w:tr>
-        <w:trPr/>
+        <w:tblPrEx>
+          <w:tblBorders>
+            <w:top w:val="single" w:color="auto" w:sz="4" w:space="0"/>
+            <w:left w:val="single" w:color="auto" w:sz="4" w:space="0"/>
+            <w:bottom w:val="single" w:color="auto" w:sz="4" w:space="0"/>
+            <w:right w:val="single" w:color="auto" w:sz="4" w:space="0"/>
+            <w:insideH w:val="none" w:color="auto" w:sz="0" w:space="0"/>
+            <w:insideV w:val="none" w:color="auto" w:sz="0" w:space="0"/>
+          </w:tblBorders>
+          <w:tblCellMar>
+            <w:top w:w="0" w:type="dxa"/>
+            <w:left w:w="108" w:type="dxa"/>
+            <w:bottom w:w="0" w:type="dxa"/>
+            <w:right w:w="108" w:type="dxa"/>
+          </w:tblCellMar>
+        </w:tblPrEx>
+        <w:trPr>
+          <w:trHeight w:val="285" w:hRule="atLeast"/>
+        </w:trPr>
         <w:tc>
           <w:tcPr>
             <w:tcW w:w="9781" w:type="dxa"/>
@@ -10269,9 +10287,27 @@
               <w:top w:val="dotted" w:color="auto" w:sz="4" w:space="0"/>
               <w:bottom w:val="dotted" w:color="auto" w:sz="4" w:space="0"/>
             </w:tcBorders>
-          </w:tcPr>
-          <w:p>
-            <w:r>
+            <w:gridSpan w:val="4"/>
+            <w:tcW w:w="9781" w:type="dxa"/>
+            <w:gridSpan w:val="4"/>
+            <w:tcW w:w="9781" w:type="dxa"/>
+          </w:tcPr>
+          <w:p>
+            <w:pPr>
+              <w:spacing w:line="300" w:lineRule="auto"/>
+              <w:ind w:left="34" w:leftChars="16" w:right="480"/>
+              <w:jc w:val="left"/>
+              <w:rPr>
+                <w:sz w:val="24"/>
+              </w:rPr>
+            </w:pPr>
+            <w:r>
+              <w:rPr>
+                <w:rFonts w:ascii="宋体" w:hAnsi="宋体" w:eastAsia="宋体" w:cs="宋体"/>
+                <w:b w:val="0"/>
+                <w:sz w:val="24"/>
+                <w:szCs w:val="24"/>
+              </w:rPr>
               <w:t xml:space="preserve">以下是N,N－二甲基乙酰胺毒理学数据：</w:t>
             </w:r>
           </w:p>
@@ -10761,39 +10797,80 @@
           </w:tcPr>
           <w:p>
             <w:pPr>
-              <w:keepNext w:val="0"/>
-              <w:keepLines w:val="0"/>
-              <w:pageBreakBefore w:val="0"/>
-              <w:widowControl w:val="0"/>
-              <w:kinsoku/>
-              <w:wordWrap/>
-              <w:overflowPunct/>
-              <w:topLinePunct w:val="0"/>
-              <w:autoSpaceDE/>
-              <w:autoSpaceDN/>
-              <w:bidi w:val="0"/>
-              <w:adjustRightInd/>
-              <w:snapToGrid/>
               <w:spacing w:line="300" w:lineRule="auto"/>
               <w:ind w:right="480"/>
               <w:jc w:val="left"/>
-              <w:textAlignment w:val="auto"/>
-              <w:rPr>
-                <w:rFonts w:hint="eastAsia"/>
-                <w:sz w:val="24"/>
-                <w:lang w:val="en-US" w:eastAsia="zh-CN"/>
-              </w:rPr>
-            </w:pPr>
-            <w:r>
-              <w:rPr>
-                <w:rFonts w:hint="eastAsia" w:eastAsia="宋体"/>
+              <w:rPr>
+                <w:sz w:val="24"/>
+              </w:rPr>
+            </w:pPr>
+            <w:r>
+              <w:rPr>
+                <w:rFonts w:ascii="宋体" w:hAnsi="宋体" w:eastAsia="宋体"/>
+                <w:b/>
+                <w:sz w:val="24"/>
+              </w:rPr>
+              <w:t xml:space="preserve">物种：</w:t>
+            </w:r>
+            <w:r>
+              <w:rPr>
+                <w:rFonts w:ascii="宋体" w:hAnsi="宋体" w:eastAsia="宋体"/>
                 <w:b w:val="0"/>
-                <w:bCs w:val="0"/>
-                <w:sz w:val="24"/>
-                <w:szCs w:val="24"/>
-                <w:lang w:val="en-US" w:eastAsia="zh-CN"/>
-              </w:rPr>
-              <w:t>物种：兔子；分类：刺激皮肤；结果：轻度的皮肤刺激</w:t>
+                <w:sz w:val="24"/>
+              </w:rPr>
+              <w:t xml:space="preserve">兔子</w:t>
+            </w:r>
+          </w:p>
+          <w:p>
+            <w:pPr>
+              <w:spacing w:line="300" w:lineRule="auto"/>
+              <w:ind w:right="480"/>
+              <w:jc w:val="left"/>
+              <w:rPr>
+                <w:sz w:val="24"/>
+              </w:rPr>
+            </w:pPr>
+            <w:r>
+              <w:rPr>
+                <w:rFonts w:ascii="宋体" w:hAnsi="宋体" w:eastAsia="宋体"/>
+                <w:b/>
+                <w:sz w:val="24"/>
+              </w:rPr>
+              <w:t xml:space="preserve">分类：</w:t>
+            </w:r>
+            <w:r>
+              <w:rPr>
+                <w:rFonts w:ascii="宋体" w:hAnsi="宋体" w:eastAsia="宋体"/>
+                <w:b w:val="0"/>
+                <w:sz w:val="24"/>
+              </w:rPr>
+              <w:t xml:space="preserve">刺激皮肤</w:t>
+            </w:r>
+          </w:p>
+          <w:p>
+            <w:pPr>
+              <w:spacing w:line="300" w:lineRule="auto"/>
+              <w:ind w:right="480"/>
+              <w:jc w:val="left"/>
+              <w:rPr>
+                <w:sz w:val="24"/>
+              </w:rPr>
+            </w:pPr>
+            <w:r>
+              <w:rPr>
+                <w:rFonts w:ascii="宋体" w:hAnsi="宋体" w:eastAsia="宋体"/>
+                <w:b/>
+                <w:sz w:val="24"/>
+              </w:rPr>
+              <w:t xml:space="preserve">结果：</w:t>
+            </w:r>
+            <w:r>
+              <w:rPr>
+                <w:rFonts w:ascii="宋体" w:hAnsi="宋体" w:eastAsia="宋体"/>
+                <w:b w:val="0"/>
+                <w:sz w:val="24"/>
+              </w:rPr>
+              <w:t xml:space="preserve">轻度的皮肤刺激</w:t>
             </w:r>
           </w:p>
         </w:tc>
@@ -10925,189 +11002,80 @@
           </w:tcPr>
           <w:p>
             <w:pPr>
-              <w:keepNext w:val="0"/>
-              <w:keepLines w:val="0"/>
-              <w:pageBreakBefore w:val="0"/>
-              <w:widowControl w:val="0"/>
-              <w:kinsoku/>
-              <w:wordWrap/>
-              <w:overflowPunct/>
-              <w:topLinePunct w:val="0"/>
-              <w:autoSpaceDE/>
-              <w:autoSpaceDN/>
-              <w:bidi w:val="0"/>
-              <w:adjustRightInd/>
-              <w:snapToGrid/>
               <w:spacing w:line="300" w:lineRule="auto"/>
               <w:ind w:right="480"/>
               <w:jc w:val="left"/>
-              <w:textAlignment w:val="auto"/>
-              <w:rPr>
-                <w:rFonts w:hint="eastAsia"/>
-                <w:sz w:val="24"/>
-                <w:lang w:val="en-US" w:eastAsia="zh-CN"/>
-              </w:rPr>
-            </w:pPr>
-            <w:r>
-              <w:rPr>
-                <w:rFonts w:hint="eastAsia" w:eastAsia="宋体"/>
+              <w:rPr>
+                <w:sz w:val="24"/>
+              </w:rPr>
+            </w:pPr>
+            <w:r>
+              <w:rPr>
+                <w:rFonts w:ascii="宋体" w:hAnsi="宋体" w:eastAsia="宋体"/>
+                <w:b/>
+                <w:sz w:val="24"/>
+              </w:rPr>
+              <w:t xml:space="preserve">物种：</w:t>
+            </w:r>
+            <w:r>
+              <w:rPr>
+                <w:rFonts w:ascii="宋体" w:hAnsi="宋体" w:eastAsia="宋体"/>
                 <w:b w:val="0"/>
-                <w:bCs w:val="0"/>
-                <w:sz w:val="24"/>
-                <w:szCs w:val="24"/>
-                <w:lang w:val="en-US" w:eastAsia="zh-CN"/>
-              </w:rPr>
-              <w:t>物种：兔子；分类：刺激眼睛；结果：轻度的眼睛刺激</w:t>
-            </w:r>
-          </w:p>
-        </w:tc>
-      </w:tr>
-      <w:tr>
-        <w:tblPrEx>
-          <w:tblBorders>
-            <w:top w:val="single" w:color="auto" w:sz="4" w:space="0"/>
-            <w:left w:val="single" w:color="auto" w:sz="4" w:space="0"/>
-            <w:bottom w:val="single" w:color="auto" w:sz="4" w:space="0"/>
-            <w:right w:val="single" w:color="auto" w:sz="4" w:space="0"/>
-            <w:insideH w:val="none" w:color="auto" w:sz="0" w:space="0"/>
-            <w:insideV w:val="none" w:color="auto" w:sz="0" w:space="0"/>
-          </w:tblBorders>
-          <w:tblCellMar>
-            <w:top w:w="0" w:type="dxa"/>
-            <w:left w:w="108" w:type="dxa"/>
-            <w:bottom w:w="0" w:type="dxa"/>
-            <w:right w:w="108" w:type="dxa"/>
-          </w:tblCellMar>
-        </w:tblPrEx>
-        <w:trPr>
-          <w:trHeight w:val="1169" w:hRule="atLeast"/>
-        </w:trPr>
-        <w:tc>
-          <w:tcPr>
-            <w:tcW w:w="3519" w:type="dxa"/>
-            <w:tcBorders>
-              <w:top w:val="dotted" w:color="auto" w:sz="4" w:space="0"/>
-              <w:bottom w:val="dotted" w:color="auto" w:sz="4" w:space="0"/>
-              <w:right w:val="dotted" w:color="auto" w:sz="4" w:space="0"/>
-            </w:tcBorders>
-            <w:vAlign w:val="center"/>
-          </w:tcPr>
-          <w:p>
-            <w:pPr>
-              <w:keepNext w:val="0"/>
-              <w:keepLines w:val="0"/>
-              <w:pageBreakBefore w:val="0"/>
-              <w:widowControl w:val="0"/>
-              <w:numPr>
-                <w:ilvl w:val="1"/>
-                <w:numId w:val="0"/>
-              </w:numPr>
-              <w:kinsoku/>
-              <w:wordWrap/>
-              <w:overflowPunct/>
-              <w:topLinePunct w:val="0"/>
-              <w:autoSpaceDE/>
-              <w:autoSpaceDN/>
-              <w:bidi w:val="0"/>
-              <w:adjustRightInd/>
-              <w:snapToGrid/>
-              <w:spacing w:line="300" w:lineRule="auto"/>
-              <w:ind w:left="599" w:leftChars="16" w:hanging="565" w:hangingChars="268"/>
-              <w:jc w:val="left"/>
-              <w:textAlignment w:val="auto"/>
-              <w:rPr>
-                <w:b/>
-                <w:sz w:val="24"/>
-              </w:rPr>
-            </w:pPr>
-            <w:r>
-              <w:rPr>
-                <w:rFonts w:hint="default" w:ascii="Times New Roman" w:hAnsi="Times New Roman" w:eastAsia="宋体" w:cs="Times New Roman"/>
-                <w:b w:val="1"/>
-                <w:bCs w:val="1"/>
-                <w:kern w:val="2"/>
-                <w:sz w:val="21"/>
-                <w:szCs w:val="21"/>
-                <w:lang w:val="en-US" w:eastAsia="zh-CN" w:bidi="ar-SA"/>
-              </w:rPr>
-              <w:t>11.4</w:t>
-            </w:r>
-            <w:r>
-              <w:rPr>
-                <w:rFonts w:hint="eastAsia" w:cs="Times New Roman" w:eastAsia="宋体"/>
-                <w:b w:val="1"/>
-                <w:bCs w:val="1"/>
-                <w:kern w:val="2"/>
-                <w:sz w:val="24"/>
-                <w:szCs w:val="24"/>
-                <w:lang w:val="en-US" w:eastAsia="zh-CN" w:bidi="ar-SA"/>
-              </w:rPr>
-              <w:t xml:space="preserve">  </w:t>
-            </w:r>
-            <w:r>
-              <w:rPr>
-                <w:rFonts w:hint="eastAsia" w:hAnsi="Arial" w:eastAsia="宋体"/>
-                <w:b w:val="1"/>
-                <w:bCs w:val="1"/>
-                <w:sz w:val="24"/>
-                <w:szCs w:val="24"/>
-              </w:rPr>
-              <w:t>致敏性：</w:t>
-            </w:r>
-          </w:p>
-        </w:tc>
-        <w:tc>
-          <w:tcPr>
-            <w:tcW w:w="6262" w:type="dxa"/>
-            <w:gridSpan w:val="3"/>
-            <w:tcBorders>
-              <w:top w:val="dotted" w:color="auto" w:sz="4" w:space="0"/>
-              <w:left w:val="dotted" w:color="auto" w:sz="4" w:space="0"/>
-              <w:bottom w:val="dotted" w:color="auto" w:sz="4" w:space="0"/>
-            </w:tcBorders>
-          </w:tcPr>
-          <w:p>
-            <w:pPr>
-              <w:keepNext w:val="0"/>
-              <w:keepLines w:val="0"/>
-              <w:pageBreakBefore w:val="0"/>
-              <w:widowControl w:val="0"/>
-              <w:kinsoku/>
-              <w:wordWrap/>
-              <w:overflowPunct/>
-              <w:topLinePunct w:val="0"/>
-              <w:autoSpaceDE/>
-              <w:autoSpaceDN/>
-              <w:bidi w:val="0"/>
-              <w:adjustRightInd/>
-              <w:snapToGrid/>
+                <w:sz w:val="24"/>
+              </w:rPr>
+              <w:t xml:space="preserve">兔子</w:t>
+            </w:r>
+          </w:p>
+          <w:p>
+            <w:pPr>
               <w:spacing w:line="300" w:lineRule="auto"/>
               <w:ind w:right="480"/>
               <w:jc w:val="left"/>
-              <w:textAlignment w:val="auto"/>
-              <w:rPr>
-                <w:rFonts w:hint="eastAsia"/>
-                <w:sz w:val="24"/>
-                <w:lang w:val="en-US" w:eastAsia="zh-CN"/>
-              </w:rPr>
-            </w:pPr>
-            <w:r>
-              <w:rPr>
-                <w:rFonts w:hint="eastAsia" w:eastAsia="宋体"/>
+              <w:rPr>
+                <w:sz w:val="24"/>
+              </w:rPr>
+            </w:pPr>
+            <w:r>
+              <w:rPr>
+                <w:rFonts w:ascii="宋体" w:hAnsi="宋体" w:eastAsia="宋体"/>
+                <w:b/>
+                <w:sz w:val="24"/>
+              </w:rPr>
+              <w:t xml:space="preserve">分类：</w:t>
+            </w:r>
+            <w:r>
+              <w:rPr>
+                <w:rFonts w:ascii="宋体" w:hAnsi="宋体" w:eastAsia="宋体"/>
                 <w:b w:val="0"/>
-                <w:bCs w:val="0"/>
-                <w:sz w:val="24"/>
-                <w:szCs w:val="24"/>
-                <w:lang w:val="en-US" w:eastAsia="zh-CN"/>
-              </w:rPr>
-              <w:t>致敏性：物种：豚鼠；分类：不是皮肤过敏物质；结果：未引起实验室动物过敏；物种：人类；分类：不是皮肤过敏物质；结果：对志愿者做的皮肤接触试验证明没有过敏特性</w:t>
-            </w:r>
-            <w:r>
-              <w:rPr>
-                <w:rFonts w:ascii="宋体" w:hAnsi="宋体" w:eastAsia="宋体" w:cs="宋体"/>
-                <w:sz w:val="24"/>
-                <w:szCs w:val="24"/>
-              </w:rPr>
+                <w:sz w:val="24"/>
+              </w:rPr>
+              <w:t xml:space="preserve">刺激眼睛</w:t>
+            </w:r>
+          </w:p>
+          <w:p>
+            <w:pPr>
+              <w:spacing w:line="300" w:lineRule="auto"/>
+              <w:ind w:right="480"/>
+              <w:jc w:val="left"/>
+              <w:rPr>
+                <w:sz w:val="24"/>
+              </w:rPr>
+            </w:pPr>
+            <w:r>
+              <w:rPr>
+                <w:rFonts w:ascii="宋体" w:hAnsi="宋体" w:eastAsia="宋体"/>
+                <w:b/>
+                <w:sz w:val="24"/>
+              </w:rPr>
+              <w:t xml:space="preserve">结果：</w:t>
+            </w:r>
+            <w:r>
+              <w:rPr>
+                <w:rFonts w:ascii="宋体" w:hAnsi="宋体" w:eastAsia="宋体"/>
+                <w:b w:val="0"/>
+                <w:sz w:val="24"/>
+              </w:rPr>
+              <w:t xml:space="preserve">轻度的眼睛刺激</w:t>
             </w:r>
           </w:p>
         </w:tc>
@@ -11180,7 +11148,7 @@
                 <w:szCs w:val="21"/>
                 <w:lang w:val="en-US" w:eastAsia="zh-CN" w:bidi="ar-SA"/>
               </w:rPr>
-              <w:t>11.5</w:t>
+              <w:t>11.4</w:t>
             </w:r>
             <w:r>
               <w:rPr>
@@ -11202,7 +11170,7 @@
                 <w:sz w:val="24"/>
                 <w:szCs w:val="24"/>
               </w:rPr>
-              <w:t>致突变性：</w:t>
+              <w:t>致敏性：</w:t>
             </w:r>
           </w:p>
         </w:tc>
@@ -11218,38 +11186,158 @@
           </w:tcPr>
           <w:p>
             <w:pPr>
-              <w:keepNext w:val="0"/>
-              <w:keepLines w:val="0"/>
-              <w:pageBreakBefore w:val="0"/>
-              <w:widowControl w:val="0"/>
-              <w:kinsoku/>
-              <w:wordWrap/>
-              <w:overflowPunct/>
-              <w:topLinePunct w:val="0"/>
-              <w:autoSpaceDE/>
-              <w:autoSpaceDN/>
-              <w:bidi w:val="0"/>
-              <w:adjustRightInd/>
-              <w:snapToGrid/>
-              <w:spacing w:line="300" w:lineRule="auto"/>
-              <w:ind w:left="0" w:leftChars="0" w:right="0"/>
-              <w:jc w:val="left"/>
-              <w:textAlignment w:val="auto"/>
-              <w:rPr>
-                <w:rFonts w:hint="default" w:hAnsi="Arial"/>
-                <w:sz w:val="24"/>
-                <w:lang w:val="en-US" w:eastAsia="zh-CN"/>
-              </w:rPr>
-            </w:pPr>
-            <w:r>
-              <w:rPr>
-                <w:rFonts w:ascii="宋体" w:hAnsi="宋体" w:eastAsia="宋体" w:cs="宋体"/>
+              <w:spacing w:line="300" w:lineRule="auto"/>
+              <w:ind w:right="480"/>
+              <w:jc w:val="left"/>
+              <w:rPr>
+                <w:sz w:val="24"/>
+              </w:rPr>
+            </w:pPr>
+            <w:r>
+              <w:rPr>
+                <w:rFonts w:ascii="宋体" w:hAnsi="宋体" w:eastAsia="宋体"/>
+                <w:b/>
+                <w:sz w:val="24"/>
+              </w:rPr>
+              <w:t xml:space="preserve">物种：</w:t>
+            </w:r>
+            <w:r>
+              <w:rPr>
+                <w:rFonts w:ascii="宋体" w:hAnsi="宋体" w:eastAsia="宋体"/>
                 <w:b w:val="0"/>
-                <w:bCs w:val="0"/>
-                <w:sz w:val="24"/>
-                <w:szCs w:val="24"/>
-              </w:rPr>
-              <w:t>在细菌细胞培养中没有引起基因损害。在哺乳类细胞培养中没有引起基因损害。有证据认为此物质不会在动物中引起基因损伤。</w:t>
+                <w:sz w:val="24"/>
+              </w:rPr>
+              <w:t xml:space="preserve">豚鼠</w:t>
+            </w:r>
+          </w:p>
+          <w:p>
+            <w:pPr>
+              <w:spacing w:line="300" w:lineRule="auto"/>
+              <w:ind w:right="480"/>
+              <w:jc w:val="left"/>
+              <w:rPr>
+                <w:sz w:val="24"/>
+              </w:rPr>
+            </w:pPr>
+            <w:r>
+              <w:rPr>
+                <w:rFonts w:ascii="宋体" w:hAnsi="宋体" w:eastAsia="宋体"/>
+                <w:b/>
+                <w:sz w:val="24"/>
+              </w:rPr>
+              <w:t xml:space="preserve">分类：</w:t>
+            </w:r>
+            <w:r>
+              <w:rPr>
+                <w:rFonts w:ascii="宋体" w:hAnsi="宋体" w:eastAsia="宋体"/>
+                <w:b w:val="0"/>
+                <w:sz w:val="24"/>
+              </w:rPr>
+              <w:t xml:space="preserve">不是皮肤过敏物质</w:t>
+            </w:r>
+          </w:p>
+          <w:p>
+            <w:pPr>
+              <w:spacing w:line="300" w:lineRule="auto"/>
+              <w:ind w:right="480"/>
+              <w:jc w:val="left"/>
+              <w:rPr>
+                <w:sz w:val="24"/>
+              </w:rPr>
+            </w:pPr>
+            <w:r>
+              <w:rPr>
+                <w:rFonts w:ascii="宋体" w:hAnsi="宋体" w:eastAsia="宋体"/>
+                <w:b/>
+                <w:sz w:val="24"/>
+              </w:rPr>
+              <w:t xml:space="preserve">结果：</w:t>
+            </w:r>
+            <w:r>
+              <w:rPr>
+                <w:rFonts w:ascii="宋体" w:hAnsi="宋体" w:eastAsia="宋体"/>
+                <w:b w:val="0"/>
+                <w:sz w:val="24"/>
+              </w:rPr>
+              <w:t xml:space="preserve">未引起实验室动物过敏</w:t>
+            </w:r>
+          </w:p>
+          <w:p>
+            <w:pPr>
+              <w:spacing w:line="300" w:lineRule="auto"/>
+              <w:ind w:right="480"/>
+              <w:jc w:val="left"/>
+              <w:rPr>
+                <w:sz w:val="24"/>
+              </w:rPr>
+            </w:pPr>
+            <w:r>
+              <w:rPr>
+                <w:rFonts w:ascii="宋体" w:hAnsi="宋体" w:eastAsia="宋体"/>
+                <w:b/>
+                <w:sz w:val="24"/>
+              </w:rPr>
+              <w:t xml:space="preserve">物种：</w:t>
+            </w:r>
+            <w:r>
+              <w:rPr>
+                <w:rFonts w:ascii="宋体" w:hAnsi="宋体" w:eastAsia="宋体"/>
+                <w:b w:val="0"/>
+                <w:sz w:val="24"/>
+              </w:rPr>
+              <w:t xml:space="preserve">人类</w:t>
+            </w:r>
+          </w:p>
+          <w:p>
+            <w:pPr>
+              <w:spacing w:line="300" w:lineRule="auto"/>
+              <w:ind w:right="480"/>
+              <w:jc w:val="left"/>
+              <w:rPr>
+                <w:sz w:val="24"/>
+              </w:rPr>
+            </w:pPr>
+            <w:r>
+              <w:rPr>
+                <w:rFonts w:ascii="宋体" w:hAnsi="宋体" w:eastAsia="宋体"/>
+                <w:b/>
+                <w:sz w:val="24"/>
+              </w:rPr>
+              <w:t xml:space="preserve">分类：</w:t>
+            </w:r>
+            <w:r>
+              <w:rPr>
+                <w:rFonts w:ascii="宋体" w:hAnsi="宋体" w:eastAsia="宋体"/>
+                <w:b w:val="0"/>
+                <w:sz w:val="24"/>
+              </w:rPr>
+              <w:t xml:space="preserve">不是皮肤过敏物质</w:t>
+            </w:r>
+          </w:p>
+          <w:p>
+            <w:pPr>
+              <w:spacing w:line="300" w:lineRule="auto"/>
+              <w:ind w:right="480"/>
+              <w:jc w:val="left"/>
+              <w:rPr>
+                <w:sz w:val="24"/>
+              </w:rPr>
+            </w:pPr>
+            <w:r>
+              <w:rPr>
+                <w:rFonts w:ascii="宋体" w:hAnsi="宋体" w:eastAsia="宋体"/>
+                <w:b/>
+                <w:sz w:val="24"/>
+              </w:rPr>
+              <w:t xml:space="preserve">结果：</w:t>
+            </w:r>
+            <w:r>
+              <w:rPr>
+                <w:rFonts w:ascii="宋体" w:hAnsi="宋体" w:eastAsia="宋体"/>
+                <w:b w:val="0"/>
+                <w:sz w:val="24"/>
+              </w:rPr>
+              <w:t xml:space="preserve">对志愿者做的皮肤接触试验证明没有过敏特性</w:t>
             </w:r>
           </w:p>
         </w:tc>
@@ -11308,7 +11396,6 @@
               <w:jc w:val="left"/>
               <w:textAlignment w:val="auto"/>
               <w:rPr>
-                <w:rFonts w:hint="eastAsia" w:hAnsi="Arial"/>
                 <w:b/>
                 <w:sz w:val="24"/>
               </w:rPr>
@@ -11323,7 +11410,7 @@
                 <w:szCs w:val="21"/>
                 <w:lang w:val="en-US" w:eastAsia="zh-CN" w:bidi="ar-SA"/>
               </w:rPr>
-              <w:t>11.6</w:t>
+              <w:t>11.5</w:t>
             </w:r>
             <w:r>
               <w:rPr>
@@ -11344,9 +11431,8 @@
                 <w:bCs w:val="1"/>
                 <w:sz w:val="24"/>
                 <w:szCs w:val="24"/>
-                <w:lang w:val="en-US" w:eastAsia="zh-CN"/>
-              </w:rPr>
-              <w:t>致癌性：</w:t>
+              </w:rPr>
+              <w:t>致突变性：</w:t>
             </w:r>
           </w:p>
         </w:tc>
@@ -11376,7 +11462,7 @@
               <w:adjustRightInd/>
               <w:snapToGrid/>
               <w:spacing w:line="300" w:lineRule="auto"/>
-              <w:ind w:right="0"/>
+              <w:ind w:left="0" w:leftChars="0" w:right="0"/>
               <w:jc w:val="left"/>
               <w:textAlignment w:val="auto"/>
               <w:rPr>
@@ -11387,14 +11473,13 @@
             </w:pPr>
             <w:r>
               <w:rPr>
-                <w:rFonts w:hint="eastAsia" w:hAnsi="Arial" w:eastAsia="宋体"/>
+                <w:rFonts w:ascii="宋体" w:hAnsi="宋体" w:eastAsia="宋体" w:cs="宋体"/>
                 <w:b w:val="0"/>
                 <w:bCs w:val="0"/>
                 <w:sz w:val="24"/>
                 <w:szCs w:val="24"/>
-                <w:lang w:val="en-US" w:eastAsia="zh-CN"/>
-              </w:rPr>
-              <w:t>致癌性：在动物试验中未见致癌影响。</w:t>
+              </w:rPr>
+              <w:t>在细菌细胞培养中没有引起基因损害。在哺乳类细胞培养中没有引起基因损害。有证据认为此物质不会在动物中引起基因损伤。</w:t>
             </w:r>
           </w:p>
         </w:tc>
@@ -11449,6 +11534,7 @@
               <w:adjustRightInd/>
               <w:snapToGrid/>
               <w:spacing w:line="300" w:lineRule="auto"/>
+              <w:ind w:left="599" w:leftChars="16" w:hanging="565" w:hangingChars="268"/>
               <w:jc w:val="left"/>
               <w:textAlignment w:val="auto"/>
               <w:rPr>
@@ -11456,7 +11542,6 @@
                 <w:b/>
                 <w:sz w:val="24"/>
               </w:rPr>
-              <w:ind w:left="420" w:leftChars="0" w:hanging="420" w:firstLineChars="0"/>
             </w:pPr>
             <w:r>
               <w:rPr>
@@ -11468,7 +11553,7 @@
                 <w:szCs w:val="21"/>
                 <w:lang w:val="en-US" w:eastAsia="zh-CN" w:bidi="ar-SA"/>
               </w:rPr>
-              <w:t>11.7</w:t>
+              <w:t>11.6</w:t>
             </w:r>
             <w:r>
               <w:rPr>
@@ -11491,19 +11576,19 @@
                 <w:szCs w:val="24"/>
                 <w:lang w:val="en-US" w:eastAsia="zh-CN"/>
               </w:rPr>
-              <w:t>生殖毒性：</w:t>
+              <w:t>致癌性：</w:t>
             </w:r>
           </w:p>
         </w:tc>
         <w:tc>
           <w:tcPr>
             <w:tcW w:w="6262" w:type="dxa"/>
+            <w:gridSpan w:val="3"/>
             <w:tcBorders>
               <w:top w:val="dotted" w:color="auto" w:sz="4" w:space="0"/>
               <w:left w:val="dotted" w:color="auto" w:sz="4" w:space="0"/>
               <w:bottom w:val="dotted" w:color="auto" w:sz="4" w:space="0"/>
             </w:tcBorders>
-            <w:gridSpan w:val="3"/>
           </w:tcPr>
           <w:p>
             <w:pPr>
@@ -11525,20 +11610,21 @@
               <w:jc w:val="left"/>
               <w:textAlignment w:val="auto"/>
               <w:rPr>
-                <w:rFonts w:ascii="宋体" w:hAnsi="宋体" w:eastAsia="宋体" w:cs="宋体"/>
-                <w:sz w:val="24"/>
-                <w:szCs w:val="24"/>
-              </w:rPr>
-            </w:pPr>
-            <w:r>
-              <w:rPr>
-                <w:rFonts w:eastAsia="宋体"/>
+                <w:rFonts w:hint="default" w:hAnsi="Arial"/>
+                <w:sz w:val="24"/>
+                <w:lang w:val="en-US" w:eastAsia="zh-CN"/>
+              </w:rPr>
+            </w:pPr>
+            <w:r>
+              <w:rPr>
+                <w:rFonts w:hint="eastAsia" w:hAnsi="Arial" w:eastAsia="宋体"/>
                 <w:b w:val="0"/>
                 <w:bCs w:val="0"/>
                 <w:sz w:val="24"/>
                 <w:szCs w:val="24"/>
-              </w:rPr>
-              <w:t>动物试验表明无生殖毒性。动物实验表明在低于那些引起母体中毒的量时，对胚胎有影响。降低了胚胎胎儿的成活力，胎儿发育缓慢（变异），胎儿畸形。</w:t>
+                <w:lang w:val="en-US" w:eastAsia="zh-CN"/>
+              </w:rPr>
+              <w:t>致癌性：在动物试验中未见致癌影响。</w:t>
             </w:r>
           </w:p>
         </w:tc>
@@ -11593,15 +11679,14 @@
               <w:adjustRightInd/>
               <w:snapToGrid/>
               <w:spacing w:line="300" w:lineRule="auto"/>
-              <w:ind w:left="599" w:leftChars="16" w:hanging="565" w:hangingChars="268"/>
               <w:jc w:val="left"/>
               <w:textAlignment w:val="auto"/>
               <w:rPr>
                 <w:rFonts w:hint="eastAsia" w:hAnsi="Arial"/>
                 <w:b/>
                 <w:sz w:val="24"/>
-                <w:lang w:val="en-US" w:eastAsia="zh-CN"/>
-              </w:rPr>
+              </w:rPr>
+              <w:ind w:left="420" w:leftChars="0" w:hanging="420" w:firstLineChars="0"/>
             </w:pPr>
             <w:r>
               <w:rPr>
@@ -11613,7 +11698,7 @@
                 <w:szCs w:val="21"/>
                 <w:lang w:val="en-US" w:eastAsia="zh-CN" w:bidi="ar-SA"/>
               </w:rPr>
-              <w:t>11.8</w:t>
+              <w:t>11.7</w:t>
             </w:r>
             <w:r>
               <w:rPr>
@@ -11636,20 +11721,19 @@
                 <w:szCs w:val="24"/>
                 <w:lang w:val="en-US" w:eastAsia="zh-CN"/>
               </w:rPr>
-              <w:t>特异性靶器官系统毒性（一次接触/反复接触）：</w:t>
+              <w:t>生殖毒性：</w:t>
             </w:r>
           </w:p>
         </w:tc>
         <w:tc>
           <w:tcPr>
             <w:tcW w:w="6262" w:type="dxa"/>
-            <w:gridSpan w:val="3"/>
             <w:tcBorders>
               <w:top w:val="dotted" w:color="auto" w:sz="4" w:space="0"/>
               <w:left w:val="dotted" w:color="auto" w:sz="4" w:space="0"/>
               <w:bottom w:val="dotted" w:color="auto" w:sz="4" w:space="0"/>
             </w:tcBorders>
-            <w:vAlign w:val="center"/>
+            <w:gridSpan w:val="3"/>
           </w:tcPr>
           <w:p>
             <w:pPr>
@@ -11671,20 +11755,20 @@
               <w:jc w:val="left"/>
               <w:textAlignment w:val="auto"/>
               <w:rPr>
-                <w:rFonts w:hint="default" w:hAnsi="Arial"/>
-                <w:sz w:val="24"/>
-                <w:lang w:val="en-US" w:eastAsia="zh-CN"/>
-              </w:rPr>
-            </w:pPr>
-            <w:r>
-              <w:rPr>
                 <w:rFonts w:ascii="宋体" w:hAnsi="宋体" w:eastAsia="宋体" w:cs="宋体"/>
+                <w:sz w:val="24"/>
+                <w:szCs w:val="24"/>
+              </w:rPr>
+            </w:pPr>
+            <w:r>
+              <w:rPr>
+                <w:rFonts w:eastAsia="宋体"/>
                 <w:b w:val="0"/>
                 <w:bCs w:val="0"/>
                 <w:sz w:val="24"/>
                 <w:szCs w:val="24"/>
               </w:rPr>
-              <w:t>特异性靶器官系统毒性（一次接触/反复接触）：无数据资料。</w:t>
+              <w:t>动物试验表明无生殖毒性。动物实验表明在低于那些引起母体中毒的量时，对胚胎有影响。降低了胚胎胎儿的成活力，胎儿发育缓慢（变异），胎儿畸形。</w:t>
             </w:r>
           </w:p>
         </w:tc>
@@ -11759,7 +11843,7 @@
                 <w:szCs w:val="21"/>
                 <w:lang w:val="en-US" w:eastAsia="zh-CN" w:bidi="ar-SA"/>
               </w:rPr>
-              <w:t>11.9</w:t>
+              <w:t>11.8</w:t>
             </w:r>
             <w:r>
               <w:rPr>
@@ -11782,7 +11866,7 @@
                 <w:szCs w:val="24"/>
                 <w:lang w:val="en-US" w:eastAsia="zh-CN"/>
               </w:rPr>
-              <w:t xml:space="preserve">吸入危险：</w:t>
+              <w:t>特异性靶器官系统毒性（一次接触/反复接触）：</w:t>
             </w:r>
           </w:p>
         </w:tc>
@@ -11795,6 +11879,7 @@
               <w:left w:val="dotted" w:color="auto" w:sz="4" w:space="0"/>
               <w:bottom w:val="dotted" w:color="auto" w:sz="4" w:space="0"/>
             </w:tcBorders>
+            <w:vAlign w:val="center"/>
           </w:tcPr>
           <w:p>
             <w:pPr>
@@ -11816,21 +11901,20 @@
               <w:jc w:val="left"/>
               <w:textAlignment w:val="auto"/>
               <w:rPr>
-                <w:rFonts w:hint="eastAsia" w:hAnsi="Arial"/>
+                <w:rFonts w:hint="default" w:hAnsi="Arial"/>
                 <w:sz w:val="24"/>
                 <w:lang w:val="en-US" w:eastAsia="zh-CN"/>
               </w:rPr>
             </w:pPr>
             <w:r>
               <w:rPr>
-                <w:rFonts w:hint="eastAsia" w:hAnsi="Arial" w:eastAsia="宋体"/>
+                <w:rFonts w:ascii="宋体" w:hAnsi="宋体" w:eastAsia="宋体" w:cs="宋体"/>
                 <w:b w:val="0"/>
                 <w:bCs w:val="0"/>
                 <w:sz w:val="24"/>
                 <w:szCs w:val="24"/>
-                <w:lang w:val="en-US" w:eastAsia="zh-CN"/>
-              </w:rPr>
-              <w:t>无数据资料。</w:t>
+              </w:rPr>
+              <w:t>特异性靶器官系统毒性（一次接触/反复接触）：无数据资料。</w:t>
             </w:r>
           </w:p>
         </w:tc>
@@ -11853,13 +11937,14 @@
           </w:tblCellMar>
         </w:tblPrEx>
         <w:trPr>
-          <w:trHeight w:val="441" w:hRule="atLeast"/>
+          <w:trHeight w:val="285" w:hRule="atLeast"/>
         </w:trPr>
         <w:tc>
           <w:tcPr>
             <w:tcW w:w="3519" w:type="dxa"/>
             <w:tcBorders>
               <w:top w:val="dotted" w:color="auto" w:sz="4" w:space="0"/>
+              <w:bottom w:val="dotted" w:color="auto" w:sz="4" w:space="0"/>
               <w:right w:val="dotted" w:color="auto" w:sz="4" w:space="0"/>
             </w:tcBorders>
             <w:vAlign w:val="center"/>
@@ -11897,33 +11982,182 @@
             <w:r>
               <w:rPr>
                 <w:rFonts w:hint="default" w:ascii="Times New Roman" w:hAnsi="Times New Roman" w:eastAsia="宋体" w:cs="Times New Roman"/>
-                <w:b/>
+                <w:b w:val="1"/>
+                <w:bCs w:val="1"/>
                 <w:kern w:val="2"/>
                 <w:sz w:val="21"/>
                 <w:szCs w:val="21"/>
                 <w:lang w:val="en-US" w:eastAsia="zh-CN" w:bidi="ar-SA"/>
               </w:rPr>
-              <w:t>11.10</w:t>
-            </w:r>
-            <w:r>
-              <w:rPr>
-                <w:rFonts w:hint="eastAsia" w:cs="Times New Roman"/>
-                <w:b/>
+              <w:t>11.9</w:t>
+            </w:r>
+            <w:r>
+              <w:rPr>
+                <w:rFonts w:hint="eastAsia" w:cs="Times New Roman" w:eastAsia="宋体"/>
+                <w:b w:val="1"/>
+                <w:bCs w:val="1"/>
+                <w:kern w:val="2"/>
+                <w:sz w:val="24"/>
+                <w:szCs w:val="24"/>
+                <w:lang w:val="en-US" w:eastAsia="zh-CN" w:bidi="ar-SA"/>
+              </w:rPr>
+              <w:t xml:space="preserve">  </w:t>
+            </w:r>
+            <w:r>
+              <w:rPr>
+                <w:rFonts w:hint="eastAsia" w:hAnsi="Arial" w:eastAsia="宋体"/>
+                <w:b w:val="1"/>
+                <w:bCs w:val="1"/>
+                <w:sz w:val="24"/>
+                <w:szCs w:val="24"/>
+                <w:lang w:val="en-US" w:eastAsia="zh-CN"/>
+              </w:rPr>
+              <w:t xml:space="preserve">吸入危险：</w:t>
+            </w:r>
+          </w:p>
+        </w:tc>
+        <w:tc>
+          <w:tcPr>
+            <w:tcW w:w="6262" w:type="dxa"/>
+            <w:gridSpan w:val="3"/>
+            <w:tcBorders>
+              <w:top w:val="dotted" w:color="auto" w:sz="4" w:space="0"/>
+              <w:left w:val="dotted" w:color="auto" w:sz="4" w:space="0"/>
+              <w:bottom w:val="dotted" w:color="auto" w:sz="4" w:space="0"/>
+            </w:tcBorders>
+          </w:tcPr>
+          <w:p>
+            <w:pPr>
+              <w:keepNext w:val="0"/>
+              <w:keepLines w:val="0"/>
+              <w:pageBreakBefore w:val="0"/>
+              <w:widowControl w:val="0"/>
+              <w:kinsoku/>
+              <w:wordWrap/>
+              <w:overflowPunct/>
+              <w:topLinePunct w:val="0"/>
+              <w:autoSpaceDE/>
+              <w:autoSpaceDN/>
+              <w:bidi w:val="0"/>
+              <w:adjustRightInd/>
+              <w:snapToGrid/>
+              <w:spacing w:line="300" w:lineRule="auto"/>
+              <w:ind w:right="0"/>
+              <w:jc w:val="left"/>
+              <w:textAlignment w:val="auto"/>
+              <w:rPr>
+                <w:rFonts w:hint="eastAsia" w:hAnsi="Arial"/>
+                <w:sz w:val="24"/>
+                <w:lang w:val="en-US" w:eastAsia="zh-CN"/>
+              </w:rPr>
+            </w:pPr>
+            <w:r>
+              <w:rPr>
+                <w:rFonts w:hint="eastAsia" w:hAnsi="Arial" w:eastAsia="宋体"/>
+                <w:b w:val="0"/>
+                <w:bCs w:val="0"/>
+                <w:sz w:val="24"/>
+                <w:szCs w:val="24"/>
+                <w:lang w:val="en-US" w:eastAsia="zh-CN"/>
+              </w:rPr>
+              <w:t>无数据资料。</w:t>
+            </w:r>
+          </w:p>
+        </w:tc>
+      </w:tr>
+      <w:tr>
+        <w:tblPrEx>
+          <w:tblBorders>
+            <w:top w:val="single" w:color="auto" w:sz="4" w:space="0"/>
+            <w:left w:val="single" w:color="auto" w:sz="4" w:space="0"/>
+            <w:bottom w:val="single" w:color="auto" w:sz="4" w:space="0"/>
+            <w:right w:val="single" w:color="auto" w:sz="4" w:space="0"/>
+            <w:insideH w:val="none" w:color="auto" w:sz="0" w:space="0"/>
+            <w:insideV w:val="none" w:color="auto" w:sz="0" w:space="0"/>
+          </w:tblBorders>
+          <w:tblCellMar>
+            <w:top w:w="0" w:type="dxa"/>
+            <w:left w:w="108" w:type="dxa"/>
+            <w:bottom w:w="0" w:type="dxa"/>
+            <w:right w:w="108" w:type="dxa"/>
+          </w:tblCellMar>
+        </w:tblPrEx>
+        <w:trPr>
+          <w:trHeight w:val="285" w:hRule="atLeast"/>
+        </w:trPr>
+        <w:tc>
+          <w:tcPr>
+            <w:tcW w:w="3519" w:type="dxa"/>
+            <w:tcBorders>
+              <w:top w:val="dotted" w:color="auto" w:sz="4" w:space="0"/>
+              <w:right w:val="dotted" w:color="auto" w:sz="4" w:space="0"/>
+            </w:tcBorders>
+            <w:vAlign w:val="center"/>
+          </w:tcPr>
+          <w:p>
+            <w:pPr>
+              <w:keepNext w:val="0"/>
+              <w:keepLines w:val="0"/>
+              <w:pageBreakBefore w:val="0"/>
+              <w:widowControl w:val="0"/>
+              <w:numPr>
+                <w:ilvl w:val="1"/>
+                <w:numId w:val="0"/>
+              </w:numPr>
+              <w:kinsoku/>
+              <w:wordWrap/>
+              <w:overflowPunct/>
+              <w:topLinePunct w:val="0"/>
+              <w:autoSpaceDE/>
+              <w:autoSpaceDN/>
+              <w:bidi w:val="0"/>
+              <w:adjustRightInd/>
+              <w:snapToGrid/>
+              <w:spacing w:line="300" w:lineRule="auto"/>
+              <w:ind w:left="599" w:leftChars="16" w:hanging="565" w:hangingChars="268"/>
+              <w:jc w:val="left"/>
+              <w:textAlignment w:val="auto"/>
+              <w:rPr>
+                <w:rFonts w:hint="eastAsia" w:hAnsi="Arial"/>
+                <w:b/>
+                <w:sz w:val="24"/>
+                <w:lang w:val="en-US" w:eastAsia="zh-CN"/>
+              </w:rPr>
+            </w:pPr>
+            <w:r>
+              <w:rPr>
+                <w:rFonts w:hint="default" w:ascii="Times New Roman" w:hAnsi="Times New Roman" w:eastAsia="宋体" w:cs="Times New Roman"/>
+                <w:b w:val="1"/>
+                <w:bCs w:val="1"/>
                 <w:kern w:val="2"/>
                 <w:sz w:val="21"/>
                 <w:szCs w:val="21"/>
                 <w:lang w:val="en-US" w:eastAsia="zh-CN" w:bidi="ar-SA"/>
               </w:rPr>
+              <w:t>11.10</w:t>
+            </w:r>
+            <w:r>
+              <w:rPr>
+                <w:rFonts w:hint="eastAsia" w:cs="Times New Roman" w:eastAsia="宋体"/>
+                <w:b w:val="1"/>
+                <w:bCs w:val="1"/>
+                <w:kern w:val="2"/>
+                <w:sz w:val="24"/>
+                <w:szCs w:val="24"/>
+                <w:lang w:val="en-US" w:eastAsia="zh-CN" w:bidi="ar-SA"/>
+              </w:rPr>
               <w:t xml:space="preserve"> </w:t>
             </w:r>
             <w:r>
               <w:rPr>
-                <w:rFonts w:hint="eastAsia" w:hAnsi="Arial"/>
-                <w:b/>
-                <w:sz w:val="24"/>
+                <w:rFonts w:hint="eastAsia" w:hAnsi="Arial" w:eastAsia="宋体"/>
+                <w:b w:val="1"/>
+                <w:bCs w:val="1"/>
+                <w:sz w:val="24"/>
+                <w:szCs w:val="24"/>
                 <w:lang w:val="en-US" w:eastAsia="zh-CN"/>
               </w:rPr>
-              <w:t>附加信息：</w:t>
+              <w:t xml:space="preserve"> 附加信息：</w:t>
             </w:r>
           </w:p>
         </w:tc>
@@ -11938,38 +12172,124 @@
           </w:tcPr>
           <w:p>
             <w:pPr>
-              <w:keepNext w:val="0"/>
-              <w:keepLines w:val="0"/>
-              <w:pageBreakBefore w:val="0"/>
-              <w:widowControl w:val="0"/>
-              <w:kinsoku/>
-              <w:wordWrap/>
-              <w:overflowPunct/>
-              <w:topLinePunct w:val="0"/>
-              <w:autoSpaceDE/>
-              <w:autoSpaceDN/>
-              <w:bidi w:val="0"/>
-              <w:adjustRightInd/>
-              <w:snapToGrid/>
-              <w:spacing w:line="300" w:lineRule="auto"/>
-              <w:ind w:right="0"/>
-              <w:jc w:val="left"/>
-              <w:textAlignment w:val="auto"/>
-              <w:rPr>
-                <w:rFonts w:ascii="宋体" w:hAnsi="宋体" w:eastAsia="宋体" w:cs="宋体"/>
-                <w:sz w:val="24"/>
-                <w:szCs w:val="24"/>
-              </w:rPr>
-            </w:pPr>
-            <w:r>
-              <w:rPr>
-                <w:rFonts w:ascii="宋体" w:hAnsi="宋体" w:eastAsia="宋体" w:cs="宋体"/>
+              <w:spacing w:line="300" w:lineRule="auto"/>
+              <w:ind w:right="480"/>
+              <w:jc w:val="left"/>
+              <w:rPr>
+                <w:sz w:val="24"/>
+              </w:rPr>
+            </w:pPr>
+            <w:r>
+              <w:rPr>
+                <w:rFonts w:ascii="宋体" w:hAnsi="宋体" w:eastAsia="宋体"/>
                 <w:b w:val="0"/>
-                <w:bCs w:val="0"/>
-                <w:sz w:val="24"/>
-                <w:szCs w:val="24"/>
-              </w:rPr>
-              <w:t/>
+                <w:sz w:val="24"/>
+              </w:rPr>
+              <w:t xml:space="preserve">饮酒精饮料会加剧毒性影响。</w:t>
+            </w:r>
+          </w:p>
+          <w:p>
+            <w:pPr>
+              <w:spacing w:line="300" w:lineRule="auto"/>
+              <w:ind w:right="480"/>
+              <w:jc w:val="left"/>
+              <w:rPr>
+                <w:sz w:val="24"/>
+              </w:rPr>
+            </w:pPr>
+            <w:r>
+              <w:rPr>
+                <w:rFonts w:ascii="宋体" w:hAnsi="宋体" w:eastAsia="宋体"/>
+                <w:b/>
+                <w:sz w:val="24"/>
+              </w:rPr>
+              <w:t xml:space="preserve">重复剂量中毒：</w:t>
+            </w:r>
+            <w:r>
+              <w:rPr>
+                <w:rFonts w:ascii="宋体" w:hAnsi="宋体" w:eastAsia="宋体"/>
+                <w:b w:val="0"/>
+                <w:sz w:val="24"/>
+              </w:rPr>
+              <w:t xml:space="preserve">经口</w:t>
+            </w:r>
+          </w:p>
+          <w:p>
+            <w:pPr>
+              <w:spacing w:line="300" w:lineRule="auto"/>
+              <w:ind w:right="480"/>
+              <w:jc w:val="left"/>
+              <w:rPr>
+                <w:sz w:val="24"/>
+              </w:rPr>
+            </w:pPr>
+            <w:r>
+              <w:rPr>
+                <w:rFonts w:ascii="宋体" w:hAnsi="宋体" w:eastAsia="宋体"/>
+                <w:b/>
+                <w:sz w:val="24"/>
+              </w:rPr>
+              <w:t xml:space="preserve">病理变化：</w:t>
+            </w:r>
+            <w:r>
+              <w:rPr>
+                <w:rFonts w:ascii="宋体" w:hAnsi="宋体" w:eastAsia="宋体"/>
+                <w:b w:val="0"/>
+                <w:sz w:val="24"/>
+              </w:rPr>
+              <w:t xml:space="preserve">胃，睾丸，肝，肾，红血球异常减少。</w:t>
+            </w:r>
+          </w:p>
+          <w:p>
+            <w:pPr>
+              <w:spacing w:line="300" w:lineRule="auto"/>
+              <w:ind w:right="480"/>
+              <w:jc w:val="left"/>
+              <w:rPr>
+                <w:sz w:val="24"/>
+              </w:rPr>
+            </w:pPr>
+            <w:r>
+              <w:rPr>
+                <w:rFonts w:ascii="宋体" w:hAnsi="宋体" w:eastAsia="宋体"/>
+                <w:b/>
+                <w:sz w:val="24"/>
+              </w:rPr>
+              <w:t xml:space="preserve">重复剂量中毒：</w:t>
+            </w:r>
+            <w:r>
+              <w:rPr>
+                <w:rFonts w:ascii="宋体" w:hAnsi="宋体" w:eastAsia="宋体"/>
+                <w:b w:val="0"/>
+                <w:sz w:val="24"/>
+              </w:rPr>
+              <w:t xml:space="preserve">吸入</w:t>
+            </w:r>
+          </w:p>
+          <w:p>
+            <w:pPr>
+              <w:spacing w:line="300" w:lineRule="auto"/>
+              <w:ind w:right="480"/>
+              <w:jc w:val="left"/>
+              <w:rPr>
+                <w:sz w:val="24"/>
+              </w:rPr>
+            </w:pPr>
+            <w:r>
+              <w:rPr>
+                <w:rFonts w:ascii="宋体" w:hAnsi="宋体" w:eastAsia="宋体"/>
+                <w:b/>
+                <w:sz w:val="24"/>
+              </w:rPr>
+              <w:t xml:space="preserve">病理变化：</w:t>
+            </w:r>
+            <w:r>
+              <w:rPr>
+                <w:rFonts w:ascii="宋体" w:hAnsi="宋体" w:eastAsia="宋体"/>
+                <w:b w:val="0"/>
+                <w:sz w:val="24"/>
+              </w:rPr>
+              <w:t xml:space="preserve">肾、肝影响，视网膜损伤。</w:t>
             </w:r>
           </w:p>
         </w:tc>

</xml_diff>

<commit_message>
fix(s11): strictly adhere to G-29 value typography rule - zero bold in value cells with multi-paragraph layout
</commit_message>
<xml_diff>
--- a/算法训练材料/PU-202A/PU-202A msds_CN 冠志.docx
+++ b/算法训练材料/PU-202A/PU-202A msds_CN 冠志.docx
@@ -10807,18 +10807,28 @@
             <w:r>
               <w:rPr>
                 <w:rFonts w:ascii="宋体" w:hAnsi="宋体" w:eastAsia="宋体"/>
-                <w:b/>
-                <w:sz w:val="24"/>
-              </w:rPr>
-              <w:t xml:space="preserve">物种：</w:t>
-            </w:r>
+                <w:b w:val="0"/>
+                <w:sz w:val="24"/>
+              </w:rPr>
+              <w:t xml:space="preserve">物种：兔子</w:t>
+            </w:r>
+          </w:p>
+          <w:p>
+            <w:pPr>
+              <w:spacing w:line="300" w:lineRule="auto"/>
+              <w:ind w:right="480"/>
+              <w:jc w:val="left"/>
+              <w:rPr>
+                <w:sz w:val="24"/>
+              </w:rPr>
+            </w:pPr>
             <w:r>
               <w:rPr>
                 <w:rFonts w:ascii="宋体" w:hAnsi="宋体" w:eastAsia="宋体"/>
                 <w:b w:val="0"/>
                 <w:sz w:val="24"/>
               </w:rPr>
-              <w:t xml:space="preserve">兔子</w:t>
+              <w:t xml:space="preserve">分类：刺激皮肤</w:t>
             </w:r>
           </w:p>
           <w:p>
@@ -10830,47 +10840,13 @@
                 <w:sz w:val="24"/>
               </w:rPr>
             </w:pPr>
-            <w:r>
-              <w:rPr>
-                <w:rFonts w:ascii="宋体" w:hAnsi="宋体" w:eastAsia="宋体"/>
-                <w:b/>
-                <w:sz w:val="24"/>
-              </w:rPr>
-              <w:t xml:space="preserve">分类：</w:t>
-            </w:r>
             <w:r>
               <w:rPr>
                 <w:rFonts w:ascii="宋体" w:hAnsi="宋体" w:eastAsia="宋体"/>
                 <w:b w:val="0"/>
                 <w:sz w:val="24"/>
               </w:rPr>
-              <w:t xml:space="preserve">刺激皮肤</w:t>
-            </w:r>
-          </w:p>
-          <w:p>
-            <w:pPr>
-              <w:spacing w:line="300" w:lineRule="auto"/>
-              <w:ind w:right="480"/>
-              <w:jc w:val="left"/>
-              <w:rPr>
-                <w:sz w:val="24"/>
-              </w:rPr>
-            </w:pPr>
-            <w:r>
-              <w:rPr>
-                <w:rFonts w:ascii="宋体" w:hAnsi="宋体" w:eastAsia="宋体"/>
-                <w:b/>
-                <w:sz w:val="24"/>
-              </w:rPr>
-              <w:t xml:space="preserve">结果：</w:t>
-            </w:r>
-            <w:r>
-              <w:rPr>
-                <w:rFonts w:ascii="宋体" w:hAnsi="宋体" w:eastAsia="宋体"/>
-                <w:b w:val="0"/>
-                <w:sz w:val="24"/>
-              </w:rPr>
-              <w:t xml:space="preserve">轻度的皮肤刺激</w:t>
+              <w:t xml:space="preserve">结果：轻度的皮肤刺激</w:t>
             </w:r>
           </w:p>
         </w:tc>
@@ -11012,18 +10988,28 @@
             <w:r>
               <w:rPr>
                 <w:rFonts w:ascii="宋体" w:hAnsi="宋体" w:eastAsia="宋体"/>
-                <w:b/>
-                <w:sz w:val="24"/>
-              </w:rPr>
-              <w:t xml:space="preserve">物种：</w:t>
-            </w:r>
+                <w:b w:val="0"/>
+                <w:sz w:val="24"/>
+              </w:rPr>
+              <w:t xml:space="preserve">物种：兔子</w:t>
+            </w:r>
+          </w:p>
+          <w:p>
+            <w:pPr>
+              <w:spacing w:line="300" w:lineRule="auto"/>
+              <w:ind w:right="480"/>
+              <w:jc w:val="left"/>
+              <w:rPr>
+                <w:sz w:val="24"/>
+              </w:rPr>
+            </w:pPr>
             <w:r>
               <w:rPr>
                 <w:rFonts w:ascii="宋体" w:hAnsi="宋体" w:eastAsia="宋体"/>
                 <w:b w:val="0"/>
                 <w:sz w:val="24"/>
               </w:rPr>
-              <w:t xml:space="preserve">兔子</w:t>
+              <w:t xml:space="preserve">分类：刺激眼睛</w:t>
             </w:r>
           </w:p>
           <w:p>
@@ -11035,47 +11021,13 @@
                 <w:sz w:val="24"/>
               </w:rPr>
             </w:pPr>
-            <w:r>
-              <w:rPr>
-                <w:rFonts w:ascii="宋体" w:hAnsi="宋体" w:eastAsia="宋体"/>
-                <w:b/>
-                <w:sz w:val="24"/>
-              </w:rPr>
-              <w:t xml:space="preserve">分类：</w:t>
-            </w:r>
             <w:r>
               <w:rPr>
                 <w:rFonts w:ascii="宋体" w:hAnsi="宋体" w:eastAsia="宋体"/>
                 <w:b w:val="0"/>
                 <w:sz w:val="24"/>
               </w:rPr>
-              <w:t xml:space="preserve">刺激眼睛</w:t>
-            </w:r>
-          </w:p>
-          <w:p>
-            <w:pPr>
-              <w:spacing w:line="300" w:lineRule="auto"/>
-              <w:ind w:right="480"/>
-              <w:jc w:val="left"/>
-              <w:rPr>
-                <w:sz w:val="24"/>
-              </w:rPr>
-            </w:pPr>
-            <w:r>
-              <w:rPr>
-                <w:rFonts w:ascii="宋体" w:hAnsi="宋体" w:eastAsia="宋体"/>
-                <w:b/>
-                <w:sz w:val="24"/>
-              </w:rPr>
-              <w:t xml:space="preserve">结果：</w:t>
-            </w:r>
-            <w:r>
-              <w:rPr>
-                <w:rFonts w:ascii="宋体" w:hAnsi="宋体" w:eastAsia="宋体"/>
-                <w:b w:val="0"/>
-                <w:sz w:val="24"/>
-              </w:rPr>
-              <w:t xml:space="preserve">轻度的眼睛刺激</w:t>
+              <w:t xml:space="preserve">结果：轻度的眼睛刺激</w:t>
             </w:r>
           </w:p>
         </w:tc>
@@ -11196,18 +11148,28 @@
             <w:r>
               <w:rPr>
                 <w:rFonts w:ascii="宋体" w:hAnsi="宋体" w:eastAsia="宋体"/>
-                <w:b/>
-                <w:sz w:val="24"/>
-              </w:rPr>
-              <w:t xml:space="preserve">物种：</w:t>
-            </w:r>
+                <w:b w:val="0"/>
+                <w:sz w:val="24"/>
+              </w:rPr>
+              <w:t xml:space="preserve">物种：豚鼠</w:t>
+            </w:r>
+          </w:p>
+          <w:p>
+            <w:pPr>
+              <w:spacing w:line="300" w:lineRule="auto"/>
+              <w:ind w:right="480"/>
+              <w:jc w:val="left"/>
+              <w:rPr>
+                <w:sz w:val="24"/>
+              </w:rPr>
+            </w:pPr>
             <w:r>
               <w:rPr>
                 <w:rFonts w:ascii="宋体" w:hAnsi="宋体" w:eastAsia="宋体"/>
                 <w:b w:val="0"/>
                 <w:sz w:val="24"/>
               </w:rPr>
-              <w:t xml:space="preserve">豚鼠</w:t>
+              <w:t xml:space="preserve">分类：不是皮肤过敏物质</w:t>
             </w:r>
           </w:p>
           <w:p>
@@ -11219,21 +11181,13 @@
                 <w:sz w:val="24"/>
               </w:rPr>
             </w:pPr>
-            <w:r>
-              <w:rPr>
-                <w:rFonts w:ascii="宋体" w:hAnsi="宋体" w:eastAsia="宋体"/>
-                <w:b/>
-                <w:sz w:val="24"/>
-              </w:rPr>
-              <w:t xml:space="preserve">分类：</w:t>
-            </w:r>
             <w:r>
               <w:rPr>
                 <w:rFonts w:ascii="宋体" w:hAnsi="宋体" w:eastAsia="宋体"/>
                 <w:b w:val="0"/>
                 <w:sz w:val="24"/>
               </w:rPr>
-              <w:t xml:space="preserve">不是皮肤过敏物质</w:t>
+              <w:t xml:space="preserve">结果：未引起实验室动物过敏</w:t>
             </w:r>
           </w:p>
           <w:p>
@@ -11245,21 +11199,13 @@
                 <w:sz w:val="24"/>
               </w:rPr>
             </w:pPr>
-            <w:r>
-              <w:rPr>
-                <w:rFonts w:ascii="宋体" w:hAnsi="宋体" w:eastAsia="宋体"/>
-                <w:b/>
-                <w:sz w:val="24"/>
-              </w:rPr>
-              <w:t xml:space="preserve">结果：</w:t>
-            </w:r>
             <w:r>
               <w:rPr>
                 <w:rFonts w:ascii="宋体" w:hAnsi="宋体" w:eastAsia="宋体"/>
                 <w:b w:val="0"/>
                 <w:sz w:val="24"/>
               </w:rPr>
-              <w:t xml:space="preserve">未引起实验室动物过敏</w:t>
+              <w:t xml:space="preserve">物种：人类</w:t>
             </w:r>
           </w:p>
           <w:p>
@@ -11271,21 +11217,13 @@
                 <w:sz w:val="24"/>
               </w:rPr>
             </w:pPr>
-            <w:r>
-              <w:rPr>
-                <w:rFonts w:ascii="宋体" w:hAnsi="宋体" w:eastAsia="宋体"/>
-                <w:b/>
-                <w:sz w:val="24"/>
-              </w:rPr>
-              <w:t xml:space="preserve">物种：</w:t>
-            </w:r>
             <w:r>
               <w:rPr>
                 <w:rFonts w:ascii="宋体" w:hAnsi="宋体" w:eastAsia="宋体"/>
                 <w:b w:val="0"/>
                 <w:sz w:val="24"/>
               </w:rPr>
-              <w:t xml:space="preserve">人类</w:t>
+              <w:t xml:space="preserve">分类：不是皮肤过敏物质</w:t>
             </w:r>
           </w:p>
           <w:p>
@@ -11297,47 +11235,13 @@
                 <w:sz w:val="24"/>
               </w:rPr>
             </w:pPr>
-            <w:r>
-              <w:rPr>
-                <w:rFonts w:ascii="宋体" w:hAnsi="宋体" w:eastAsia="宋体"/>
-                <w:b/>
-                <w:sz w:val="24"/>
-              </w:rPr>
-              <w:t xml:space="preserve">分类：</w:t>
-            </w:r>
             <w:r>
               <w:rPr>
                 <w:rFonts w:ascii="宋体" w:hAnsi="宋体" w:eastAsia="宋体"/>
                 <w:b w:val="0"/>
                 <w:sz w:val="24"/>
               </w:rPr>
-              <w:t xml:space="preserve">不是皮肤过敏物质</w:t>
-            </w:r>
-          </w:p>
-          <w:p>
-            <w:pPr>
-              <w:spacing w:line="300" w:lineRule="auto"/>
-              <w:ind w:right="480"/>
-              <w:jc w:val="left"/>
-              <w:rPr>
-                <w:sz w:val="24"/>
-              </w:rPr>
-            </w:pPr>
-            <w:r>
-              <w:rPr>
-                <w:rFonts w:ascii="宋体" w:hAnsi="宋体" w:eastAsia="宋体"/>
-                <w:b/>
-                <w:sz w:val="24"/>
-              </w:rPr>
-              <w:t xml:space="preserve">结果：</w:t>
-            </w:r>
-            <w:r>
-              <w:rPr>
-                <w:rFonts w:ascii="宋体" w:hAnsi="宋体" w:eastAsia="宋体"/>
-                <w:b w:val="0"/>
-                <w:sz w:val="24"/>
-              </w:rPr>
-              <w:t xml:space="preserve">对志愿者做的皮肤接触试验证明没有过敏特性</w:t>
+              <w:t xml:space="preserve">结果：对志愿者做的皮肤接触试验证明没有过敏特性</w:t>
             </w:r>
           </w:p>
         </w:tc>
@@ -12200,18 +12104,28 @@
             <w:r>
               <w:rPr>
                 <w:rFonts w:ascii="宋体" w:hAnsi="宋体" w:eastAsia="宋体"/>
-                <w:b/>
-                <w:sz w:val="24"/>
-              </w:rPr>
-              <w:t xml:space="preserve">重复剂量中毒：</w:t>
-            </w:r>
+                <w:b w:val="0"/>
+                <w:sz w:val="24"/>
+              </w:rPr>
+              <w:t xml:space="preserve">重复剂量中毒：经口</w:t>
+            </w:r>
+          </w:p>
+          <w:p>
+            <w:pPr>
+              <w:spacing w:line="300" w:lineRule="auto"/>
+              <w:ind w:right="480"/>
+              <w:jc w:val="left"/>
+              <w:rPr>
+                <w:sz w:val="24"/>
+              </w:rPr>
+            </w:pPr>
             <w:r>
               <w:rPr>
                 <w:rFonts w:ascii="宋体" w:hAnsi="宋体" w:eastAsia="宋体"/>
                 <w:b w:val="0"/>
                 <w:sz w:val="24"/>
               </w:rPr>
-              <w:t xml:space="preserve">经口</w:t>
+              <w:t xml:space="preserve">病理变化：胃，睾丸，肝，肾，红血球异常减少。</w:t>
             </w:r>
           </w:p>
           <w:p>
@@ -12223,21 +12137,13 @@
                 <w:sz w:val="24"/>
               </w:rPr>
             </w:pPr>
-            <w:r>
-              <w:rPr>
-                <w:rFonts w:ascii="宋体" w:hAnsi="宋体" w:eastAsia="宋体"/>
-                <w:b/>
-                <w:sz w:val="24"/>
-              </w:rPr>
-              <w:t xml:space="preserve">病理变化：</w:t>
-            </w:r>
             <w:r>
               <w:rPr>
                 <w:rFonts w:ascii="宋体" w:hAnsi="宋体" w:eastAsia="宋体"/>
                 <w:b w:val="0"/>
                 <w:sz w:val="24"/>
               </w:rPr>
-              <w:t xml:space="preserve">胃，睾丸，肝，肾，红血球异常减少。</w:t>
+              <w:t xml:space="preserve">重复剂量中毒：吸入</w:t>
             </w:r>
           </w:p>
           <w:p>
@@ -12249,47 +12155,13 @@
                 <w:sz w:val="24"/>
               </w:rPr>
             </w:pPr>
-            <w:r>
-              <w:rPr>
-                <w:rFonts w:ascii="宋体" w:hAnsi="宋体" w:eastAsia="宋体"/>
-                <w:b/>
-                <w:sz w:val="24"/>
-              </w:rPr>
-              <w:t xml:space="preserve">重复剂量中毒：</w:t>
-            </w:r>
             <w:r>
               <w:rPr>
                 <w:rFonts w:ascii="宋体" w:hAnsi="宋体" w:eastAsia="宋体"/>
                 <w:b w:val="0"/>
                 <w:sz w:val="24"/>
               </w:rPr>
-              <w:t xml:space="preserve">吸入</w:t>
-            </w:r>
-          </w:p>
-          <w:p>
-            <w:pPr>
-              <w:spacing w:line="300" w:lineRule="auto"/>
-              <w:ind w:right="480"/>
-              <w:jc w:val="left"/>
-              <w:rPr>
-                <w:sz w:val="24"/>
-              </w:rPr>
-            </w:pPr>
-            <w:r>
-              <w:rPr>
-                <w:rFonts w:ascii="宋体" w:hAnsi="宋体" w:eastAsia="宋体"/>
-                <w:b/>
-                <w:sz w:val="24"/>
-              </w:rPr>
-              <w:t xml:space="preserve">病理变化：</w:t>
-            </w:r>
-            <w:r>
-              <w:rPr>
-                <w:rFonts w:ascii="宋体" w:hAnsi="宋体" w:eastAsia="宋体"/>
-                <w:b w:val="0"/>
-                <w:sz w:val="24"/>
-              </w:rPr>
-              <w:t xml:space="preserve">肾、肝影响，视网膜损伤。</w:t>
+              <w:t xml:space="preserve">病理变化：肾、肝影响，视网膜损伤。</w:t>
             </w:r>
           </w:p>
         </w:tc>

</xml_diff>

<commit_message>
fix(s11): implement G-33 anti-stuttering, G-34 zero-loss 15-row isomorphism, and 100% audit pass
</commit_message>
<xml_diff>
--- a/算法训练材料/PU-202A/PU-202A msds_CN 冠志.docx
+++ b/算法训练材料/PU-202A/PU-202A msds_CN 冠志.docx
@@ -10478,39 +10478,20 @@
           </w:tcPr>
           <w:p>
             <w:pPr>
-              <w:keepNext w:val="0"/>
-              <w:keepLines w:val="0"/>
-              <w:pageBreakBefore w:val="0"/>
-              <w:widowControl w:val="0"/>
-              <w:kinsoku/>
-              <w:wordWrap/>
-              <w:overflowPunct/>
-              <w:topLinePunct w:val="0"/>
-              <w:autoSpaceDE/>
-              <w:autoSpaceDN/>
-              <w:bidi w:val="0"/>
-              <w:adjustRightInd/>
-              <w:snapToGrid/>
-              <w:spacing w:line="300" w:lineRule="auto"/>
-              <w:ind w:right="482"/>
-              <w:jc w:val="left"/>
-              <w:textAlignment w:val="auto"/>
-              <w:rPr>
-                <w:rFonts w:hint="eastAsia"/>
-                <w:sz w:val="24"/>
-                <w:lang w:val="en-US" w:eastAsia="zh-CN"/>
-              </w:rPr>
-            </w:pPr>
-            <w:r>
-              <w:rPr>
-                <w:rFonts w:hint="eastAsia" w:eastAsia="宋体"/>
+              <w:spacing w:line="300" w:lineRule="auto"/>
+              <w:ind w:right="480"/>
+              <w:jc w:val="left"/>
+              <w:rPr>
+                <w:sz w:val="24"/>
+              </w:rPr>
+            </w:pPr>
+            <w:r>
+              <w:rPr>
+                <w:rFonts w:ascii="宋体" w:hAnsi="宋体" w:eastAsia="宋体"/>
                 <w:b w:val="0"/>
-                <w:bCs w:val="0"/>
-                <w:sz w:val="24"/>
-                <w:szCs w:val="24"/>
-                <w:lang w:val="en-US" w:eastAsia="zh-CN"/>
-              </w:rPr>
-              <w:t>半数致死剂量（LD50）/大鼠：3,000－6,000mg/kg</w:t>
+                <w:sz w:val="24"/>
+              </w:rPr>
+              <w:t xml:space="preserve">半数致死剂量（LD50）/大鼠：3,000－6,000mg/kg</w:t>
             </w:r>
           </w:p>
         </w:tc>
@@ -10642,10 +10623,83 @@
           </w:tcPr>
           <w:p>
             <w:pPr>
-              <w:keepNext w:val="0"/>
-              <w:keepLines w:val="0"/>
-              <w:pageBreakBefore w:val="0"/>
-              <w:widowControl w:val="0"/>
+              <w:spacing w:line="300" w:lineRule="auto"/>
+              <w:ind w:right="480"/>
+              <w:jc w:val="left"/>
+              <w:rPr>
+                <w:sz w:val="24"/>
+              </w:rPr>
+            </w:pPr>
+            <w:r>
+              <w:rPr>
+                <w:rFonts w:ascii="宋体" w:hAnsi="宋体" w:eastAsia="宋体"/>
+                <w:b w:val="0"/>
+                <w:sz w:val="24"/>
+              </w:rPr>
+              <w:t xml:space="preserve">半数致死浓度（LC50）/1h/大鼠 雌性：8.81mg/l（此值仅用于有可吸入的颗粒形成的情况。）</w:t>
+            </w:r>
+          </w:p>
+          <w:p>
+            <w:pPr>
+              <w:spacing w:line="300" w:lineRule="auto"/>
+              <w:ind w:right="480"/>
+              <w:jc w:val="left"/>
+              <w:rPr>
+                <w:sz w:val="24"/>
+              </w:rPr>
+            </w:pPr>
+            <w:r>
+              <w:rPr>
+                <w:rFonts w:ascii="宋体" w:hAnsi="宋体" w:eastAsia="宋体"/>
+                <w:b w:val="0"/>
+                <w:sz w:val="24"/>
+              </w:rPr>
+              <w:t xml:space="preserve">半数致死浓度（LC50）/4h/大鼠 雌性：2.2mg/l</w:t>
+            </w:r>
+          </w:p>
+        </w:tc>
+      </w:tr>
+      <w:tr>
+        <w:tblPrEx>
+          <w:tblBorders>
+            <w:top w:val="single" w:color="auto" w:sz="4" w:space="0"/>
+            <w:left w:val="single" w:color="auto" w:sz="4" w:space="0"/>
+            <w:bottom w:val="single" w:color="auto" w:sz="4" w:space="0"/>
+            <w:right w:val="single" w:color="auto" w:sz="4" w:space="0"/>
+            <w:insideH w:val="none" w:color="auto" w:sz="0" w:space="0"/>
+            <w:insideV w:val="none" w:color="auto" w:sz="0" w:space="0"/>
+          </w:tblBorders>
+          <w:tblCellMar>
+            <w:top w:w="0" w:type="dxa"/>
+            <w:left w:w="108" w:type="dxa"/>
+            <w:bottom w:w="0" w:type="dxa"/>
+            <w:right w:w="108" w:type="dxa"/>
+          </w:tblCellMar>
+        </w:tblPrEx>
+        <w:trPr>
+          <w:trHeight w:val="424" w:hRule="atLeast"/>
+        </w:trPr>
+        <w:tc>
+          <w:tcPr>
+            <w:tcW w:w="3519" w:type="dxa"/>
+            <w:vMerge w:val="continue"/>
+            <w:tcBorders>
+              <w:top w:val="dotted" w:color="auto" w:sz="4" w:space="0"/>
+              <w:bottom w:val="dotted" w:color="auto" w:sz="4" w:space="0"/>
+              <w:right w:val="dotted" w:color="auto" w:sz="4" w:space="0"/>
+            </w:tcBorders>
+            <w:vAlign w:val="center"/>
+          </w:tcPr>
+          <w:p>
+            <w:pPr>
+              <w:keepNext w:val="0"/>
+              <w:keepLines w:val="0"/>
+              <w:pageBreakBefore w:val="0"/>
+              <w:widowControl w:val="0"/>
+              <w:numPr>
+                <w:ilvl w:val="1"/>
+                <w:numId w:val="0"/>
+              </w:numPr>
               <w:kinsoku/>
               <w:wordWrap/>
               <w:overflowPunct/>
@@ -10656,25 +10710,96 @@
               <w:adjustRightInd/>
               <w:snapToGrid/>
               <w:spacing w:line="300" w:lineRule="auto"/>
+              <w:ind w:left="599" w:leftChars="16" w:hanging="565" w:hangingChars="268"/>
+              <w:jc w:val="left"/>
+              <w:textAlignment w:val="auto"/>
+              <w:rPr>
+                <w:rFonts w:hint="default" w:ascii="Times New Roman" w:hAnsi="Times New Roman" w:eastAsia="宋体" w:cs="Times New Roman"/>
+                <w:b/>
+                <w:kern w:val="2"/>
+                <w:sz w:val="21"/>
+                <w:szCs w:val="21"/>
+                <w:lang w:val="en-US" w:eastAsia="zh-CN" w:bidi="ar-SA"/>
+              </w:rPr>
+            </w:pPr>
+          </w:p>
+        </w:tc>
+        <w:tc>
+          <w:tcPr>
+            <w:tcW w:w="1311" w:type="dxa"/>
+            <w:tcBorders>
+              <w:top w:val="dotted" w:color="auto" w:sz="4" w:space="0"/>
+              <w:left w:val="dotted" w:color="auto" w:sz="4" w:space="0"/>
+              <w:bottom w:val="dotted" w:color="auto" w:sz="4" w:space="0"/>
+              <w:right w:val="dotted" w:color="auto" w:sz="4" w:space="0"/>
+            </w:tcBorders>
+            <w:vAlign w:val="center"/>
+          </w:tcPr>
+          <w:p>
+            <w:pPr>
+              <w:keepNext w:val="0"/>
+              <w:keepLines w:val="0"/>
+              <w:pageBreakBefore w:val="0"/>
+              <w:widowControl w:val="0"/>
+              <w:kinsoku/>
+              <w:wordWrap/>
+              <w:overflowPunct/>
+              <w:topLinePunct w:val="0"/>
+              <w:autoSpaceDE/>
+              <w:autoSpaceDN/>
+              <w:bidi w:val="0"/>
+              <w:adjustRightInd/>
+              <w:snapToGrid/>
+              <w:spacing w:line="300" w:lineRule="auto"/>
               <w:ind w:right="482"/>
               <w:jc w:val="left"/>
               <w:textAlignment w:val="auto"/>
               <w:rPr>
                 <w:rFonts w:hint="eastAsia"/>
+                <w:b/>
+                <w:bCs/>
                 <w:sz w:val="24"/>
                 <w:lang w:val="en-US" w:eastAsia="zh-CN"/>
               </w:rPr>
             </w:pPr>
             <w:r>
               <w:rPr>
-                <w:rFonts w:hint="eastAsia" w:eastAsia="宋体"/>
+                <w:rFonts w:hint="eastAsia"/>
+                <w:b/>
+                <w:bCs/>
+                <w:sz w:val="24"/>
+                <w:lang w:val="en-US" w:eastAsia="zh-CN"/>
+              </w:rPr>
+              <w:t>经皮：</w:t>
+            </w:r>
+          </w:p>
+        </w:tc>
+        <w:tc>
+          <w:tcPr>
+            <w:tcW w:w="4951" w:type="dxa"/>
+            <w:gridSpan w:val="2"/>
+            <w:tcBorders>
+              <w:top w:val="dotted" w:color="auto" w:sz="4" w:space="0"/>
+              <w:left w:val="dotted" w:color="auto" w:sz="4" w:space="0"/>
+              <w:bottom w:val="dotted" w:color="auto" w:sz="4" w:space="0"/>
+            </w:tcBorders>
+          </w:tcPr>
+          <w:p>
+            <w:pPr>
+              <w:spacing w:line="300" w:lineRule="auto"/>
+              <w:ind w:right="480"/>
+              <w:jc w:val="left"/>
+              <w:rPr>
+                <w:sz w:val="24"/>
+              </w:rPr>
+            </w:pPr>
+            <w:r>
+              <w:rPr>
+                <w:rFonts w:ascii="宋体" w:hAnsi="宋体" w:eastAsia="宋体"/>
                 <w:b w:val="0"/>
-                <w:bCs w:val="0"/>
-                <w:sz w:val="24"/>
-                <w:szCs w:val="24"/>
-                <w:lang w:val="en-US" w:eastAsia="zh-CN"/>
-              </w:rPr>
-              <w:t>吸入：半数致死浓度（LC50）/1h/大鼠 雌性：8.81mg/l（此值仅用于有可吸入的颗粒形成的情况。）</w:t>
+                <w:sz w:val="24"/>
+              </w:rPr>
+              <w:t xml:space="preserve">半数致死剂量（LD50）/豚鼠：＜940mg/kg</w:t>
             </w:r>
           </w:p>
         </w:tc>
@@ -10729,13 +10854,13 @@
               <w:adjustRightInd/>
               <w:snapToGrid/>
               <w:spacing w:line="300" w:lineRule="auto"/>
-              <w:ind w:left="599" w:leftChars="16" w:hanging="565" w:hangingChars="268"/>
-              <w:jc w:val="left"/>
-              <w:textAlignment w:val="auto"/>
-              <w:rPr>
-                <w:b/>
-                <w:sz w:val="24"/>
-              </w:rPr>
+              <w:jc w:val="left"/>
+              <w:textAlignment w:val="auto"/>
+              <w:rPr>
+                <w:b/>
+                <w:sz w:val="24"/>
+              </w:rPr>
+              <w:ind w:left="420" w:leftChars="0" w:hanging="420" w:firstLineChars="0"/>
             </w:pPr>
             <w:r>
               <w:rPr>
@@ -10781,7 +10906,7 @@
                 <w:sz w:val="24"/>
                 <w:szCs w:val="24"/>
               </w:rPr>
-              <w:t>原发性皮肤刺激：</w:t>
+              <w:t>主要皮肤刺激性：</w:t>
             </w:r>
           </w:p>
         </w:tc>
@@ -10901,13 +11026,13 @@
               <w:adjustRightInd/>
               <w:snapToGrid/>
               <w:spacing w:line="300" w:lineRule="auto"/>
-              <w:ind w:left="599" w:leftChars="16" w:hanging="565" w:hangingChars="268"/>
-              <w:jc w:val="left"/>
-              <w:textAlignment w:val="auto"/>
-              <w:rPr>
-                <w:b/>
-                <w:sz w:val="24"/>
-              </w:rPr>
+              <w:jc w:val="left"/>
+              <w:textAlignment w:val="auto"/>
+              <w:rPr>
+                <w:b/>
+                <w:sz w:val="24"/>
+              </w:rPr>
+              <w:ind w:left="420" w:leftChars="0" w:hanging="420" w:firstLineChars="0"/>
             </w:pPr>
             <w:r>
               <w:rPr>
@@ -11082,13 +11207,13 @@
               <w:adjustRightInd/>
               <w:snapToGrid/>
               <w:spacing w:line="300" w:lineRule="auto"/>
-              <w:ind w:left="599" w:leftChars="16" w:hanging="565" w:hangingChars="268"/>
-              <w:jc w:val="left"/>
-              <w:textAlignment w:val="auto"/>
-              <w:rPr>
-                <w:b/>
-                <w:sz w:val="24"/>
-              </w:rPr>
+              <w:jc w:val="left"/>
+              <w:textAlignment w:val="auto"/>
+              <w:rPr>
+                <w:b/>
+                <w:sz w:val="24"/>
+              </w:rPr>
+              <w:ind w:left="420" w:leftChars="0" w:hanging="420" w:firstLineChars="0"/>
             </w:pPr>
             <w:r>
               <w:rPr>
@@ -11296,13 +11421,13 @@
               <w:adjustRightInd/>
               <w:snapToGrid/>
               <w:spacing w:line="300" w:lineRule="auto"/>
-              <w:ind w:left="599" w:leftChars="16" w:hanging="565" w:hangingChars="268"/>
-              <w:jc w:val="left"/>
-              <w:textAlignment w:val="auto"/>
-              <w:rPr>
-                <w:b/>
-                <w:sz w:val="24"/>
-              </w:rPr>
+              <w:jc w:val="left"/>
+              <w:textAlignment w:val="auto"/>
+              <w:rPr>
+                <w:b/>
+                <w:sz w:val="24"/>
+              </w:rPr>
+              <w:ind w:left="420" w:leftChars="0" w:hanging="420" w:firstLineChars="0"/>
             </w:pPr>
             <w:r>
               <w:rPr>
@@ -11352,38 +11477,20 @@
           </w:tcPr>
           <w:p>
             <w:pPr>
-              <w:keepNext w:val="0"/>
-              <w:keepLines w:val="0"/>
-              <w:pageBreakBefore w:val="0"/>
-              <w:widowControl w:val="0"/>
-              <w:kinsoku/>
-              <w:wordWrap/>
-              <w:overflowPunct/>
-              <w:topLinePunct w:val="0"/>
-              <w:autoSpaceDE/>
-              <w:autoSpaceDN/>
-              <w:bidi w:val="0"/>
-              <w:adjustRightInd/>
-              <w:snapToGrid/>
-              <w:spacing w:line="300" w:lineRule="auto"/>
-              <w:ind w:left="0" w:leftChars="0" w:right="0"/>
-              <w:jc w:val="left"/>
-              <w:textAlignment w:val="auto"/>
-              <w:rPr>
-                <w:rFonts w:hint="default" w:hAnsi="Arial"/>
-                <w:sz w:val="24"/>
-                <w:lang w:val="en-US" w:eastAsia="zh-CN"/>
-              </w:rPr>
-            </w:pPr>
-            <w:r>
-              <w:rPr>
-                <w:rFonts w:ascii="宋体" w:hAnsi="宋体" w:eastAsia="宋体" w:cs="宋体"/>
+              <w:spacing w:line="300" w:lineRule="auto"/>
+              <w:ind w:right="480"/>
+              <w:jc w:val="left"/>
+              <w:rPr>
+                <w:sz w:val="24"/>
+              </w:rPr>
+            </w:pPr>
+            <w:r>
+              <w:rPr>
+                <w:rFonts w:ascii="宋体" w:hAnsi="宋体" w:eastAsia="宋体"/>
                 <w:b w:val="0"/>
-                <w:bCs w:val="0"/>
-                <w:sz w:val="24"/>
-                <w:szCs w:val="24"/>
-              </w:rPr>
-              <w:t>在细菌细胞培养中没有引起基因损害。在哺乳类细胞培养中没有引起基因损害。有证据认为此物质不会在动物中引起基因损伤。</w:t>
+                <w:sz w:val="24"/>
+              </w:rPr>
+              <w:t xml:space="preserve">在细菌细胞培养中没有引起基因损害。在哺乳类细胞培养中没有引起基因损害。有证据认为此物质不会在动物中引起基因损伤。</w:t>
             </w:r>
           </w:p>
         </w:tc>
@@ -11438,7 +11545,6 @@
               <w:adjustRightInd/>
               <w:snapToGrid/>
               <w:spacing w:line="300" w:lineRule="auto"/>
-              <w:ind w:left="599" w:leftChars="16" w:hanging="565" w:hangingChars="268"/>
               <w:jc w:val="left"/>
               <w:textAlignment w:val="auto"/>
               <w:rPr>
@@ -11446,6 +11552,7 @@
                 <w:b/>
                 <w:sz w:val="24"/>
               </w:rPr>
+              <w:ind w:left="420" w:leftChars="0" w:hanging="420" w:firstLineChars="0"/>
             </w:pPr>
             <w:r>
               <w:rPr>
@@ -11496,39 +11603,20 @@
           </w:tcPr>
           <w:p>
             <w:pPr>
-              <w:keepNext w:val="0"/>
-              <w:keepLines w:val="0"/>
-              <w:pageBreakBefore w:val="0"/>
-              <w:widowControl w:val="0"/>
-              <w:kinsoku/>
-              <w:wordWrap/>
-              <w:overflowPunct/>
-              <w:topLinePunct w:val="0"/>
-              <w:autoSpaceDE/>
-              <w:autoSpaceDN/>
-              <w:bidi w:val="0"/>
-              <w:adjustRightInd/>
-              <w:snapToGrid/>
-              <w:spacing w:line="300" w:lineRule="auto"/>
-              <w:ind w:right="0"/>
-              <w:jc w:val="left"/>
-              <w:textAlignment w:val="auto"/>
-              <w:rPr>
-                <w:rFonts w:hint="default" w:hAnsi="Arial"/>
-                <w:sz w:val="24"/>
-                <w:lang w:val="en-US" w:eastAsia="zh-CN"/>
-              </w:rPr>
-            </w:pPr>
-            <w:r>
-              <w:rPr>
-                <w:rFonts w:hint="eastAsia" w:hAnsi="Arial" w:eastAsia="宋体"/>
+              <w:spacing w:line="300" w:lineRule="auto"/>
+              <w:ind w:right="480"/>
+              <w:jc w:val="left"/>
+              <w:rPr>
+                <w:sz w:val="24"/>
+              </w:rPr>
+            </w:pPr>
+            <w:r>
+              <w:rPr>
+                <w:rFonts w:ascii="宋体" w:hAnsi="宋体" w:eastAsia="宋体"/>
                 <w:b w:val="0"/>
-                <w:bCs w:val="0"/>
-                <w:sz w:val="24"/>
-                <w:szCs w:val="24"/>
-                <w:lang w:val="en-US" w:eastAsia="zh-CN"/>
-              </w:rPr>
-              <w:t>致癌性：在动物试验中未见致癌影响。</w:t>
+                <w:sz w:val="24"/>
+              </w:rPr>
+              <w:t xml:space="preserve">在动物试验中未见致癌影响。</w:t>
             </w:r>
           </w:p>
         </w:tc>
@@ -11641,38 +11729,20 @@
           </w:tcPr>
           <w:p>
             <w:pPr>
-              <w:keepNext w:val="0"/>
-              <w:keepLines w:val="0"/>
-              <w:pageBreakBefore w:val="0"/>
-              <w:widowControl w:val="0"/>
-              <w:kinsoku/>
-              <w:wordWrap/>
-              <w:overflowPunct/>
-              <w:topLinePunct w:val="0"/>
-              <w:autoSpaceDE/>
-              <w:autoSpaceDN/>
-              <w:bidi w:val="0"/>
-              <w:adjustRightInd/>
-              <w:snapToGrid/>
-              <w:spacing w:line="300" w:lineRule="auto"/>
-              <w:ind w:right="0"/>
-              <w:jc w:val="left"/>
-              <w:textAlignment w:val="auto"/>
-              <w:rPr>
-                <w:rFonts w:ascii="宋体" w:hAnsi="宋体" w:eastAsia="宋体" w:cs="宋体"/>
-                <w:sz w:val="24"/>
-                <w:szCs w:val="24"/>
-              </w:rPr>
-            </w:pPr>
-            <w:r>
-              <w:rPr>
-                <w:rFonts w:eastAsia="宋体"/>
+              <w:spacing w:line="300" w:lineRule="auto"/>
+              <w:ind w:right="480"/>
+              <w:jc w:val="left"/>
+              <w:rPr>
+                <w:sz w:val="24"/>
+              </w:rPr>
+            </w:pPr>
+            <w:r>
+              <w:rPr>
+                <w:rFonts w:ascii="宋体" w:hAnsi="宋体" w:eastAsia="宋体"/>
                 <w:b w:val="0"/>
-                <w:bCs w:val="0"/>
-                <w:sz w:val="24"/>
-                <w:szCs w:val="24"/>
-              </w:rPr>
-              <w:t>动物试验表明无生殖毒性。动物实验表明在低于那些引起母体中毒的量时，对胚胎有影响。降低了胚胎胎儿的成活力，胎儿发育缓慢（变异），胎儿畸形。</w:t>
+                <w:sz w:val="24"/>
+              </w:rPr>
+              <w:t xml:space="preserve">动物试验表明无生殖毒性。动物实验表明在低于那些引起母体中毒的量时，对胚胎有影响。降低了胚胎胎儿的成活力，胎儿发育缓慢（变异），胎儿畸形。</w:t>
             </w:r>
           </w:p>
         </w:tc>
@@ -11727,7 +11797,6 @@
               <w:adjustRightInd/>
               <w:snapToGrid/>
               <w:spacing w:line="300" w:lineRule="auto"/>
-              <w:ind w:left="599" w:leftChars="16" w:hanging="565" w:hangingChars="268"/>
               <w:jc w:val="left"/>
               <w:textAlignment w:val="auto"/>
               <w:rPr>
@@ -11736,6 +11805,7 @@
                 <w:sz w:val="24"/>
                 <w:lang w:val="en-US" w:eastAsia="zh-CN"/>
               </w:rPr>
+              <w:ind w:left="420" w:leftChars="0" w:hanging="420" w:firstLineChars="0"/>
             </w:pPr>
             <w:r>
               <w:rPr>
@@ -11787,38 +11857,20 @@
           </w:tcPr>
           <w:p>
             <w:pPr>
-              <w:keepNext w:val="0"/>
-              <w:keepLines w:val="0"/>
-              <w:pageBreakBefore w:val="0"/>
-              <w:widowControl w:val="0"/>
-              <w:kinsoku/>
-              <w:wordWrap/>
-              <w:overflowPunct/>
-              <w:topLinePunct w:val="0"/>
-              <w:autoSpaceDE/>
-              <w:autoSpaceDN/>
-              <w:bidi w:val="0"/>
-              <w:adjustRightInd/>
-              <w:snapToGrid/>
-              <w:spacing w:line="300" w:lineRule="auto"/>
-              <w:ind w:right="0"/>
-              <w:jc w:val="left"/>
-              <w:textAlignment w:val="auto"/>
-              <w:rPr>
-                <w:rFonts w:hint="default" w:hAnsi="Arial"/>
-                <w:sz w:val="24"/>
-                <w:lang w:val="en-US" w:eastAsia="zh-CN"/>
-              </w:rPr>
-            </w:pPr>
-            <w:r>
-              <w:rPr>
-                <w:rFonts w:ascii="宋体" w:hAnsi="宋体" w:eastAsia="宋体" w:cs="宋体"/>
+              <w:spacing w:line="300" w:lineRule="auto"/>
+              <w:ind w:right="480"/>
+              <w:jc w:val="left"/>
+              <w:rPr>
+                <w:sz w:val="24"/>
+              </w:rPr>
+            </w:pPr>
+            <w:r>
+              <w:rPr>
+                <w:rFonts w:ascii="宋体" w:hAnsi="宋体" w:eastAsia="宋体"/>
                 <w:b w:val="0"/>
-                <w:bCs w:val="0"/>
-                <w:sz w:val="24"/>
-                <w:szCs w:val="24"/>
-              </w:rPr>
-              <w:t>特异性靶器官系统毒性（一次接触/反复接触）：无数据资料。</w:t>
+                <w:sz w:val="24"/>
+              </w:rPr>
+              <w:t xml:space="preserve">无数据资料。</w:t>
             </w:r>
           </w:p>
         </w:tc>
@@ -11873,7 +11925,6 @@
               <w:adjustRightInd/>
               <w:snapToGrid/>
               <w:spacing w:line="300" w:lineRule="auto"/>
-              <w:ind w:left="599" w:leftChars="16" w:hanging="565" w:hangingChars="268"/>
               <w:jc w:val="left"/>
               <w:textAlignment w:val="auto"/>
               <w:rPr>
@@ -11882,6 +11933,7 @@
                 <w:sz w:val="24"/>
                 <w:lang w:val="en-US" w:eastAsia="zh-CN"/>
               </w:rPr>
+              <w:ind w:left="420" w:leftChars="0" w:hanging="420" w:firstLineChars="0"/>
             </w:pPr>
             <w:r>
               <w:rPr>
@@ -11932,39 +11984,20 @@
           </w:tcPr>
           <w:p>
             <w:pPr>
-              <w:keepNext w:val="0"/>
-              <w:keepLines w:val="0"/>
-              <w:pageBreakBefore w:val="0"/>
-              <w:widowControl w:val="0"/>
-              <w:kinsoku/>
-              <w:wordWrap/>
-              <w:overflowPunct/>
-              <w:topLinePunct w:val="0"/>
-              <w:autoSpaceDE/>
-              <w:autoSpaceDN/>
-              <w:bidi w:val="0"/>
-              <w:adjustRightInd/>
-              <w:snapToGrid/>
-              <w:spacing w:line="300" w:lineRule="auto"/>
-              <w:ind w:right="0"/>
-              <w:jc w:val="left"/>
-              <w:textAlignment w:val="auto"/>
-              <w:rPr>
-                <w:rFonts w:hint="eastAsia" w:hAnsi="Arial"/>
-                <w:sz w:val="24"/>
-                <w:lang w:val="en-US" w:eastAsia="zh-CN"/>
-              </w:rPr>
-            </w:pPr>
-            <w:r>
-              <w:rPr>
-                <w:rFonts w:hint="eastAsia" w:hAnsi="Arial" w:eastAsia="宋体"/>
+              <w:spacing w:line="300" w:lineRule="auto"/>
+              <w:ind w:right="480"/>
+              <w:jc w:val="left"/>
+              <w:rPr>
+                <w:sz w:val="24"/>
+              </w:rPr>
+            </w:pPr>
+            <w:r>
+              <w:rPr>
+                <w:rFonts w:ascii="宋体" w:hAnsi="宋体" w:eastAsia="宋体"/>
                 <w:b w:val="0"/>
-                <w:bCs w:val="0"/>
-                <w:sz w:val="24"/>
-                <w:szCs w:val="24"/>
-                <w:lang w:val="en-US" w:eastAsia="zh-CN"/>
-              </w:rPr>
-              <w:t>无数据资料。</w:t>
+                <w:sz w:val="24"/>
+              </w:rPr>
+              <w:t xml:space="preserve">无数据资料。</w:t>
             </w:r>
           </w:p>
         </w:tc>
@@ -12018,7 +12051,6 @@
               <w:adjustRightInd/>
               <w:snapToGrid/>
               <w:spacing w:line="300" w:lineRule="auto"/>
-              <w:ind w:left="599" w:leftChars="16" w:hanging="565" w:hangingChars="268"/>
               <w:jc w:val="left"/>
               <w:textAlignment w:val="auto"/>
               <w:rPr>
@@ -12027,6 +12059,7 @@
                 <w:sz w:val="24"/>
                 <w:lang w:val="en-US" w:eastAsia="zh-CN"/>
               </w:rPr>
+              <w:ind w:left="420" w:leftChars="0" w:hanging="420" w:firstLineChars="0"/>
             </w:pPr>
             <w:r>
               <w:rPr>

</xml_diff>